<commit_message>
Improve guide research questions and statistical plan
</commit_message>
<xml_diff>
--- a/outputs/guide_review_pack/06_research_questions_hypotheses_and_stats.docx
+++ b/outputs/guide_review_pack/06_research_questions_hypotheses_and_stats.docx
@@ -32,49 +32,1393 @@
         <w:pStyle w:val="Heading1"/>
       </w:pPr>
       <w:r>
-        <w:t>Current Research Questions</w:t>
+        <w:t>Purpose</w:t>
+      </w:r>
+    </w:p>
+    <w:p>
+      <w:r>
+        <w:t>This document converts the research direction into testable questions and dataset-dependent hypotheses. The final RQs and hypotheses should be fixed only after outcome, variables and validation data are confirmed.</w:t>
       </w:r>
     </w:p>
     <w:p>
       <w:pPr>
-        <w:pStyle w:val="ListNumber"/>
+        <w:pStyle w:val="Heading1"/>
       </w:pPr>
       <w:r>
-        <w:t>Which clinical, embryological and contextual factors are useful for personalized IVF outcome prediction?</w:t>
+        <w:t>Research Question Selection Logic</w:t>
       </w:r>
     </w:p>
+    <w:tbl>
+      <w:tblPr>
+        <w:tblStyle w:val="TableGrid"/>
+        <w:tblW w:type="auto" w:w="0"/>
+        <w:jc w:val="center"/>
+        <w:tblLook w:firstColumn="1" w:firstRow="1" w:lastColumn="0" w:lastRow="0" w:noHBand="0" w:noVBand="1" w:val="04A0"/>
+      </w:tblPr>
+      <w:tblGrid>
+        <w:gridCol w:w="4680"/>
+        <w:gridCol w:w="4680"/>
+      </w:tblGrid>
+      <w:tr>
+        <w:tc>
+          <w:tcPr>
+            <w:tcW w:type="dxa" w:w="792"/>
+            <w:shd w:fill="F2F4F7"/>
+            <w:vAlign w:val="center"/>
+          </w:tcPr>
+          <w:p>
+            <w:pPr>
+              <w:spacing w:after="0"/>
+            </w:pPr>
+            <w:r/>
+            <w:r>
+              <w:rPr>
+                <w:rFonts w:ascii="Calibri" w:hAnsi="Calibri"/>
+                <w:b/>
+                <w:sz w:val="18"/>
+              </w:rPr>
+              <w:t>Step</w:t>
+            </w:r>
+          </w:p>
+        </w:tc>
+        <w:tc>
+          <w:tcPr>
+            <w:tcW w:type="dxa" w:w="8280"/>
+            <w:shd w:fill="F2F4F7"/>
+            <w:vAlign w:val="center"/>
+          </w:tcPr>
+          <w:p>
+            <w:pPr>
+              <w:spacing w:after="0"/>
+            </w:pPr>
+            <w:r/>
+            <w:r>
+              <w:rPr>
+                <w:rFonts w:ascii="Calibri" w:hAnsi="Calibri"/>
+                <w:b/>
+                <w:sz w:val="18"/>
+              </w:rPr>
+              <w:t>Decision</w:t>
+            </w:r>
+          </w:p>
+        </w:tc>
+      </w:tr>
+      <w:tr>
+        <w:tc>
+          <w:tcPr>
+            <w:tcW w:type="dxa" w:w="792"/>
+            <w:vAlign w:val="center"/>
+          </w:tcPr>
+          <w:p>
+            <w:pPr>
+              <w:spacing w:after="0"/>
+            </w:pPr>
+            <w:r/>
+            <w:r>
+              <w:rPr>
+                <w:rFonts w:ascii="Calibri" w:hAnsi="Calibri"/>
+                <w:b w:val="0"/>
+                <w:sz w:val="18"/>
+              </w:rPr>
+              <w:t>1</w:t>
+            </w:r>
+          </w:p>
+        </w:tc>
+        <w:tc>
+          <w:tcPr>
+            <w:tcW w:type="dxa" w:w="8280"/>
+            <w:vAlign w:val="center"/>
+          </w:tcPr>
+          <w:p>
+            <w:pPr>
+              <w:spacing w:after="0"/>
+            </w:pPr>
+            <w:r/>
+            <w:r>
+              <w:rPr>
+                <w:rFonts w:ascii="Calibri" w:hAnsi="Calibri"/>
+                <w:b w:val="0"/>
+                <w:sz w:val="18"/>
+              </w:rPr>
+              <w:t>Confirm available outcome: live birth, clinical pregnancy, miscarriage or another IVF target.</w:t>
+            </w:r>
+          </w:p>
+        </w:tc>
+      </w:tr>
+      <w:tr>
+        <w:tc>
+          <w:tcPr>
+            <w:tcW w:type="dxa" w:w="792"/>
+            <w:vAlign w:val="center"/>
+          </w:tcPr>
+          <w:p>
+            <w:pPr>
+              <w:spacing w:after="0"/>
+            </w:pPr>
+            <w:r/>
+            <w:r>
+              <w:rPr>
+                <w:rFonts w:ascii="Calibri" w:hAnsi="Calibri"/>
+                <w:b w:val="0"/>
+                <w:sz w:val="18"/>
+              </w:rPr>
+              <w:t>2</w:t>
+            </w:r>
+          </w:p>
+        </w:tc>
+        <w:tc>
+          <w:tcPr>
+            <w:tcW w:type="dxa" w:w="8280"/>
+            <w:vAlign w:val="center"/>
+          </w:tcPr>
+          <w:p>
+            <w:pPr>
+              <w:spacing w:after="0"/>
+            </w:pPr>
+            <w:r/>
+            <w:r>
+              <w:rPr>
+                <w:rFonts w:ascii="Calibri" w:hAnsi="Calibri"/>
+                <w:b w:val="0"/>
+                <w:sz w:val="18"/>
+              </w:rPr>
+              <w:t>Confirm available predictors: clinical, embryology, lifestyle, imaging or mixed data.</w:t>
+            </w:r>
+          </w:p>
+        </w:tc>
+      </w:tr>
+      <w:tr>
+        <w:tc>
+          <w:tcPr>
+            <w:tcW w:type="dxa" w:w="792"/>
+            <w:vAlign w:val="center"/>
+          </w:tcPr>
+          <w:p>
+            <w:pPr>
+              <w:spacing w:after="0"/>
+            </w:pPr>
+            <w:r/>
+            <w:r>
+              <w:rPr>
+                <w:rFonts w:ascii="Calibri" w:hAnsi="Calibri"/>
+                <w:b w:val="0"/>
+                <w:sz w:val="18"/>
+              </w:rPr>
+              <w:t>3</w:t>
+            </w:r>
+          </w:p>
+        </w:tc>
+        <w:tc>
+          <w:tcPr>
+            <w:tcW w:type="dxa" w:w="8280"/>
+            <w:vAlign w:val="center"/>
+          </w:tcPr>
+          <w:p>
+            <w:pPr>
+              <w:spacing w:after="0"/>
+            </w:pPr>
+            <w:r/>
+            <w:r>
+              <w:rPr>
+                <w:rFonts w:ascii="Calibri" w:hAnsi="Calibri"/>
+                <w:b w:val="0"/>
+                <w:sz w:val="18"/>
+              </w:rPr>
+              <w:t>Confirm validation option: internal, temporal, external, multi-clinic or subgroup validation.</w:t>
+            </w:r>
+          </w:p>
+        </w:tc>
+      </w:tr>
+      <w:tr>
+        <w:tc>
+          <w:tcPr>
+            <w:tcW w:type="dxa" w:w="792"/>
+            <w:vAlign w:val="center"/>
+          </w:tcPr>
+          <w:p>
+            <w:pPr>
+              <w:spacing w:after="0"/>
+            </w:pPr>
+            <w:r/>
+            <w:r>
+              <w:rPr>
+                <w:rFonts w:ascii="Calibri" w:hAnsi="Calibri"/>
+                <w:b w:val="0"/>
+                <w:sz w:val="18"/>
+              </w:rPr>
+              <w:t>4</w:t>
+            </w:r>
+          </w:p>
+        </w:tc>
+        <w:tc>
+          <w:tcPr>
+            <w:tcW w:type="dxa" w:w="8280"/>
+            <w:vAlign w:val="center"/>
+          </w:tcPr>
+          <w:p>
+            <w:pPr>
+              <w:spacing w:after="0"/>
+            </w:pPr>
+            <w:r/>
+            <w:r>
+              <w:rPr>
+                <w:rFonts w:ascii="Calibri" w:hAnsi="Calibri"/>
+                <w:b w:val="0"/>
+                <w:sz w:val="18"/>
+              </w:rPr>
+              <w:t>Confirm whether clinician review of explanation outputs is possible.</w:t>
+            </w:r>
+          </w:p>
+        </w:tc>
+      </w:tr>
+      <w:tr>
+        <w:tc>
+          <w:tcPr>
+            <w:tcW w:type="dxa" w:w="792"/>
+            <w:vAlign w:val="center"/>
+          </w:tcPr>
+          <w:p>
+            <w:pPr>
+              <w:spacing w:after="0"/>
+            </w:pPr>
+            <w:r/>
+            <w:r>
+              <w:rPr>
+                <w:rFonts w:ascii="Calibri" w:hAnsi="Calibri"/>
+                <w:b w:val="0"/>
+                <w:sz w:val="18"/>
+              </w:rPr>
+              <w:t>5</w:t>
+            </w:r>
+          </w:p>
+        </w:tc>
+        <w:tc>
+          <w:tcPr>
+            <w:tcW w:type="dxa" w:w="8280"/>
+            <w:vAlign w:val="center"/>
+          </w:tcPr>
+          <w:p>
+            <w:pPr>
+              <w:spacing w:after="0"/>
+            </w:pPr>
+            <w:r/>
+            <w:r>
+              <w:rPr>
+                <w:rFonts w:ascii="Calibri" w:hAnsi="Calibri"/>
+                <w:b w:val="0"/>
+                <w:sz w:val="18"/>
+              </w:rPr>
+              <w:t>Select only RQs and hypotheses that can be tested with the available data.</w:t>
+            </w:r>
+          </w:p>
+        </w:tc>
+      </w:tr>
+    </w:tbl>
+    <w:p/>
     <w:p>
       <w:pPr>
-        <w:pStyle w:val="ListNumber"/>
+        <w:pStyle w:val="Heading1"/>
       </w:pPr>
       <w:r>
-        <w:t>Can a multimodal machine-learning model predict IVF outcomes better than a single-data-type model?</w:t>
+        <w:t>Core Research Questions</w:t>
       </w:r>
     </w:p>
+    <w:tbl>
+      <w:tblPr>
+        <w:tblStyle w:val="TableGrid"/>
+        <w:tblW w:type="auto" w:w="0"/>
+        <w:jc w:val="center"/>
+        <w:tblLook w:firstColumn="1" w:firstRow="1" w:lastColumn="0" w:lastRow="0" w:noHBand="0" w:noVBand="1" w:val="04A0"/>
+      </w:tblPr>
+      <w:tblGrid>
+        <w:gridCol w:w="3120"/>
+        <w:gridCol w:w="3120"/>
+        <w:gridCol w:w="3120"/>
+      </w:tblGrid>
+      <w:tr>
+        <w:tc>
+          <w:tcPr>
+            <w:tcW w:type="dxa" w:w="792"/>
+            <w:shd w:fill="F2F4F7"/>
+            <w:vAlign w:val="center"/>
+          </w:tcPr>
+          <w:p>
+            <w:pPr>
+              <w:spacing w:after="0"/>
+            </w:pPr>
+            <w:r/>
+            <w:r>
+              <w:rPr>
+                <w:rFonts w:ascii="Calibri" w:hAnsi="Calibri"/>
+                <w:b/>
+                <w:sz w:val="18"/>
+              </w:rPr>
+              <w:t>RQ</w:t>
+            </w:r>
+          </w:p>
+        </w:tc>
+        <w:tc>
+          <w:tcPr>
+            <w:tcW w:type="dxa" w:w="5112"/>
+            <w:shd w:fill="F2F4F7"/>
+            <w:vAlign w:val="center"/>
+          </w:tcPr>
+          <w:p>
+            <w:pPr>
+              <w:spacing w:after="0"/>
+            </w:pPr>
+            <w:r/>
+            <w:r>
+              <w:rPr>
+                <w:rFonts w:ascii="Calibri" w:hAnsi="Calibri"/>
+                <w:b/>
+                <w:sz w:val="18"/>
+              </w:rPr>
+              <w:t>Research Question</w:t>
+            </w:r>
+          </w:p>
+        </w:tc>
+        <w:tc>
+          <w:tcPr>
+            <w:tcW w:type="dxa" w:w="3168"/>
+            <w:shd w:fill="F2F4F7"/>
+            <w:vAlign w:val="center"/>
+          </w:tcPr>
+          <w:p>
+            <w:pPr>
+              <w:spacing w:after="0"/>
+            </w:pPr>
+            <w:r/>
+            <w:r>
+              <w:rPr>
+                <w:rFonts w:ascii="Calibri" w:hAnsi="Calibri"/>
+                <w:b/>
+                <w:sz w:val="18"/>
+              </w:rPr>
+              <w:t>Required Data</w:t>
+            </w:r>
+          </w:p>
+        </w:tc>
+      </w:tr>
+      <w:tr>
+        <w:tc>
+          <w:tcPr>
+            <w:tcW w:type="dxa" w:w="792"/>
+            <w:vAlign w:val="center"/>
+          </w:tcPr>
+          <w:p>
+            <w:pPr>
+              <w:spacing w:after="0"/>
+            </w:pPr>
+            <w:r/>
+            <w:r>
+              <w:rPr>
+                <w:rFonts w:ascii="Calibri" w:hAnsi="Calibri"/>
+                <w:b w:val="0"/>
+                <w:sz w:val="18"/>
+              </w:rPr>
+              <w:t>RQ1</w:t>
+            </w:r>
+          </w:p>
+        </w:tc>
+        <w:tc>
+          <w:tcPr>
+            <w:tcW w:type="dxa" w:w="5112"/>
+            <w:vAlign w:val="center"/>
+          </w:tcPr>
+          <w:p>
+            <w:pPr>
+              <w:spacing w:after="0"/>
+            </w:pPr>
+            <w:r/>
+            <w:r>
+              <w:rPr>
+                <w:rFonts w:ascii="Calibri" w:hAnsi="Calibri"/>
+                <w:b w:val="0"/>
+                <w:sz w:val="18"/>
+              </w:rPr>
+              <w:t>Which available clinical variables are associated with IVF outcome prediction?</w:t>
+            </w:r>
+          </w:p>
+        </w:tc>
+        <w:tc>
+          <w:tcPr>
+            <w:tcW w:type="dxa" w:w="3168"/>
+            <w:vAlign w:val="center"/>
+          </w:tcPr>
+          <w:p>
+            <w:pPr>
+              <w:spacing w:after="0"/>
+            </w:pPr>
+            <w:r/>
+            <w:r>
+              <w:rPr>
+                <w:rFonts w:ascii="Calibri" w:hAnsi="Calibri"/>
+                <w:b w:val="0"/>
+                <w:sz w:val="18"/>
+              </w:rPr>
+              <w:t>Clinical variables plus reliable outcome.</w:t>
+            </w:r>
+          </w:p>
+        </w:tc>
+      </w:tr>
+      <w:tr>
+        <w:tc>
+          <w:tcPr>
+            <w:tcW w:type="dxa" w:w="792"/>
+            <w:vAlign w:val="center"/>
+          </w:tcPr>
+          <w:p>
+            <w:pPr>
+              <w:spacing w:after="0"/>
+            </w:pPr>
+            <w:r/>
+            <w:r>
+              <w:rPr>
+                <w:rFonts w:ascii="Calibri" w:hAnsi="Calibri"/>
+                <w:b w:val="0"/>
+                <w:sz w:val="18"/>
+              </w:rPr>
+              <w:t>RQ2</w:t>
+            </w:r>
+          </w:p>
+        </w:tc>
+        <w:tc>
+          <w:tcPr>
+            <w:tcW w:type="dxa" w:w="5112"/>
+            <w:vAlign w:val="center"/>
+          </w:tcPr>
+          <w:p>
+            <w:pPr>
+              <w:spacing w:after="0"/>
+            </w:pPr>
+            <w:r/>
+            <w:r>
+              <w:rPr>
+                <w:rFonts w:ascii="Calibri" w:hAnsi="Calibri"/>
+                <w:b w:val="0"/>
+                <w:sz w:val="18"/>
+              </w:rPr>
+              <w:t>Can ML models predict IVF outcome better than a baseline statistical model?</w:t>
+            </w:r>
+          </w:p>
+        </w:tc>
+        <w:tc>
+          <w:tcPr>
+            <w:tcW w:type="dxa" w:w="3168"/>
+            <w:vAlign w:val="center"/>
+          </w:tcPr>
+          <w:p>
+            <w:pPr>
+              <w:spacing w:after="0"/>
+            </w:pPr>
+            <w:r/>
+            <w:r>
+              <w:rPr>
+                <w:rFonts w:ascii="Calibri" w:hAnsi="Calibri"/>
+                <w:b w:val="0"/>
+                <w:sz w:val="18"/>
+              </w:rPr>
+              <w:t>Enough records, outcome balance and clinical predictors.</w:t>
+            </w:r>
+          </w:p>
+        </w:tc>
+      </w:tr>
+      <w:tr>
+        <w:tc>
+          <w:tcPr>
+            <w:tcW w:type="dxa" w:w="792"/>
+            <w:vAlign w:val="center"/>
+          </w:tcPr>
+          <w:p>
+            <w:pPr>
+              <w:spacing w:after="0"/>
+            </w:pPr>
+            <w:r/>
+            <w:r>
+              <w:rPr>
+                <w:rFonts w:ascii="Calibri" w:hAnsi="Calibri"/>
+                <w:b w:val="0"/>
+                <w:sz w:val="18"/>
+              </w:rPr>
+              <w:t>RQ3</w:t>
+            </w:r>
+          </w:p>
+        </w:tc>
+        <w:tc>
+          <w:tcPr>
+            <w:tcW w:type="dxa" w:w="5112"/>
+            <w:vAlign w:val="center"/>
+          </w:tcPr>
+          <w:p>
+            <w:pPr>
+              <w:spacing w:after="0"/>
+            </w:pPr>
+            <w:r/>
+            <w:r>
+              <w:rPr>
+                <w:rFonts w:ascii="Calibri" w:hAnsi="Calibri"/>
+                <w:b w:val="0"/>
+                <w:sz w:val="18"/>
+              </w:rPr>
+              <w:t>Does adding embryology variables improve prediction compared with clinical variables alone?</w:t>
+            </w:r>
+          </w:p>
+        </w:tc>
+        <w:tc>
+          <w:tcPr>
+            <w:tcW w:type="dxa" w:w="3168"/>
+            <w:vAlign w:val="center"/>
+          </w:tcPr>
+          <w:p>
+            <w:pPr>
+              <w:spacing w:after="0"/>
+            </w:pPr>
+            <w:r/>
+            <w:r>
+              <w:rPr>
+                <w:rFonts w:ascii="Calibri" w:hAnsi="Calibri"/>
+                <w:b w:val="0"/>
+                <w:sz w:val="18"/>
+              </w:rPr>
+              <w:t>Clinical plus structured embryology variables.</w:t>
+            </w:r>
+          </w:p>
+        </w:tc>
+      </w:tr>
+      <w:tr>
+        <w:tc>
+          <w:tcPr>
+            <w:tcW w:type="dxa" w:w="792"/>
+            <w:vAlign w:val="center"/>
+          </w:tcPr>
+          <w:p>
+            <w:pPr>
+              <w:spacing w:after="0"/>
+            </w:pPr>
+            <w:r/>
+            <w:r>
+              <w:rPr>
+                <w:rFonts w:ascii="Calibri" w:hAnsi="Calibri"/>
+                <w:b w:val="0"/>
+                <w:sz w:val="18"/>
+              </w:rPr>
+              <w:t>RQ4</w:t>
+            </w:r>
+          </w:p>
+        </w:tc>
+        <w:tc>
+          <w:tcPr>
+            <w:tcW w:type="dxa" w:w="5112"/>
+            <w:vAlign w:val="center"/>
+          </w:tcPr>
+          <w:p>
+            <w:pPr>
+              <w:spacing w:after="0"/>
+            </w:pPr>
+            <w:r/>
+            <w:r>
+              <w:rPr>
+                <w:rFonts w:ascii="Calibri" w:hAnsi="Calibri"/>
+                <w:b w:val="0"/>
+                <w:sz w:val="18"/>
+              </w:rPr>
+              <w:t>Do lifestyle/contextual variables add predictive or personalization value?</w:t>
+            </w:r>
+          </w:p>
+        </w:tc>
+        <w:tc>
+          <w:tcPr>
+            <w:tcW w:type="dxa" w:w="3168"/>
+            <w:vAlign w:val="center"/>
+          </w:tcPr>
+          <w:p>
+            <w:pPr>
+              <w:spacing w:after="0"/>
+            </w:pPr>
+            <w:r/>
+            <w:r>
+              <w:rPr>
+                <w:rFonts w:ascii="Calibri" w:hAnsi="Calibri"/>
+                <w:b w:val="0"/>
+                <w:sz w:val="18"/>
+              </w:rPr>
+              <w:t>Reliable lifestyle/contextual variables.</w:t>
+            </w:r>
+          </w:p>
+        </w:tc>
+      </w:tr>
+      <w:tr>
+        <w:tc>
+          <w:tcPr>
+            <w:tcW w:type="dxa" w:w="792"/>
+            <w:vAlign w:val="center"/>
+          </w:tcPr>
+          <w:p>
+            <w:pPr>
+              <w:spacing w:after="0"/>
+            </w:pPr>
+            <w:r/>
+            <w:r>
+              <w:rPr>
+                <w:rFonts w:ascii="Calibri" w:hAnsi="Calibri"/>
+                <w:b w:val="0"/>
+                <w:sz w:val="18"/>
+              </w:rPr>
+              <w:t>RQ5</w:t>
+            </w:r>
+          </w:p>
+        </w:tc>
+        <w:tc>
+          <w:tcPr>
+            <w:tcW w:type="dxa" w:w="5112"/>
+            <w:vAlign w:val="center"/>
+          </w:tcPr>
+          <w:p>
+            <w:pPr>
+              <w:spacing w:after="0"/>
+            </w:pPr>
+            <w:r/>
+            <w:r>
+              <w:rPr>
+                <w:rFonts w:ascii="Calibri" w:hAnsi="Calibri"/>
+                <w:b w:val="0"/>
+                <w:sz w:val="18"/>
+              </w:rPr>
+              <w:t>Which variables most influence individual predictions according to XAI methods?</w:t>
+            </w:r>
+          </w:p>
+        </w:tc>
+        <w:tc>
+          <w:tcPr>
+            <w:tcW w:type="dxa" w:w="3168"/>
+            <w:vAlign w:val="center"/>
+          </w:tcPr>
+          <w:p>
+            <w:pPr>
+              <w:spacing w:after="0"/>
+            </w:pPr>
+            <w:r/>
+            <w:r>
+              <w:rPr>
+                <w:rFonts w:ascii="Calibri" w:hAnsi="Calibri"/>
+                <w:b w:val="0"/>
+                <w:sz w:val="18"/>
+              </w:rPr>
+              <w:t>Trained model plus interpretable features.</w:t>
+            </w:r>
+          </w:p>
+        </w:tc>
+      </w:tr>
+      <w:tr>
+        <w:tc>
+          <w:tcPr>
+            <w:tcW w:type="dxa" w:w="792"/>
+            <w:vAlign w:val="center"/>
+          </w:tcPr>
+          <w:p>
+            <w:pPr>
+              <w:spacing w:after="0"/>
+            </w:pPr>
+            <w:r/>
+            <w:r>
+              <w:rPr>
+                <w:rFonts w:ascii="Calibri" w:hAnsi="Calibri"/>
+                <w:b w:val="0"/>
+                <w:sz w:val="18"/>
+              </w:rPr>
+              <w:t>RQ6</w:t>
+            </w:r>
+          </w:p>
+        </w:tc>
+        <w:tc>
+          <w:tcPr>
+            <w:tcW w:type="dxa" w:w="5112"/>
+            <w:vAlign w:val="center"/>
+          </w:tcPr>
+          <w:p>
+            <w:pPr>
+              <w:spacing w:after="0"/>
+            </w:pPr>
+            <w:r/>
+            <w:r>
+              <w:rPr>
+                <w:rFonts w:ascii="Calibri" w:hAnsi="Calibri"/>
+                <w:b w:val="0"/>
+                <w:sz w:val="18"/>
+              </w:rPr>
+              <w:t>Are model probabilities well calibrated for counseling?</w:t>
+            </w:r>
+          </w:p>
+        </w:tc>
+        <w:tc>
+          <w:tcPr>
+            <w:tcW w:type="dxa" w:w="3168"/>
+            <w:vAlign w:val="center"/>
+          </w:tcPr>
+          <w:p>
+            <w:pPr>
+              <w:spacing w:after="0"/>
+            </w:pPr>
+            <w:r/>
+            <w:r>
+              <w:rPr>
+                <w:rFonts w:ascii="Calibri" w:hAnsi="Calibri"/>
+                <w:b w:val="0"/>
+                <w:sz w:val="18"/>
+              </w:rPr>
+              <w:t>Predicted probabilities plus observed outcomes.</w:t>
+            </w:r>
+          </w:p>
+        </w:tc>
+      </w:tr>
+      <w:tr>
+        <w:tc>
+          <w:tcPr>
+            <w:tcW w:type="dxa" w:w="792"/>
+            <w:vAlign w:val="center"/>
+          </w:tcPr>
+          <w:p>
+            <w:pPr>
+              <w:spacing w:after="0"/>
+            </w:pPr>
+            <w:r/>
+            <w:r>
+              <w:rPr>
+                <w:rFonts w:ascii="Calibri" w:hAnsi="Calibri"/>
+                <w:b w:val="0"/>
+                <w:sz w:val="18"/>
+              </w:rPr>
+              <w:t>RQ7</w:t>
+            </w:r>
+          </w:p>
+        </w:tc>
+        <w:tc>
+          <w:tcPr>
+            <w:tcW w:type="dxa" w:w="5112"/>
+            <w:vAlign w:val="center"/>
+          </w:tcPr>
+          <w:p>
+            <w:pPr>
+              <w:spacing w:after="0"/>
+            </w:pPr>
+            <w:r/>
+            <w:r>
+              <w:rPr>
+                <w:rFonts w:ascii="Calibri" w:hAnsi="Calibri"/>
+                <w:b w:val="0"/>
+                <w:sz w:val="18"/>
+              </w:rPr>
+              <w:t>Does performance differ across age, diagnosis, transfer type or other subgroups?</w:t>
+            </w:r>
+          </w:p>
+        </w:tc>
+        <w:tc>
+          <w:tcPr>
+            <w:tcW w:type="dxa" w:w="3168"/>
+            <w:vAlign w:val="center"/>
+          </w:tcPr>
+          <w:p>
+            <w:pPr>
+              <w:spacing w:after="0"/>
+            </w:pPr>
+            <w:r/>
+            <w:r>
+              <w:rPr>
+                <w:rFonts w:ascii="Calibri" w:hAnsi="Calibri"/>
+                <w:b w:val="0"/>
+                <w:sz w:val="18"/>
+              </w:rPr>
+              <w:t>Subgroup variables with sufficient sample size.</w:t>
+            </w:r>
+          </w:p>
+        </w:tc>
+      </w:tr>
+      <w:tr>
+        <w:tc>
+          <w:tcPr>
+            <w:tcW w:type="dxa" w:w="792"/>
+            <w:vAlign w:val="center"/>
+          </w:tcPr>
+          <w:p>
+            <w:pPr>
+              <w:spacing w:after="0"/>
+            </w:pPr>
+            <w:r/>
+            <w:r>
+              <w:rPr>
+                <w:rFonts w:ascii="Calibri" w:hAnsi="Calibri"/>
+                <w:b w:val="0"/>
+                <w:sz w:val="18"/>
+              </w:rPr>
+              <w:t>RQ8</w:t>
+            </w:r>
+          </w:p>
+        </w:tc>
+        <w:tc>
+          <w:tcPr>
+            <w:tcW w:type="dxa" w:w="5112"/>
+            <w:vAlign w:val="center"/>
+          </w:tcPr>
+          <w:p>
+            <w:pPr>
+              <w:spacing w:after="0"/>
+            </w:pPr>
+            <w:r/>
+            <w:r>
+              <w:rPr>
+                <w:rFonts w:ascii="Calibri" w:hAnsi="Calibri"/>
+                <w:b w:val="0"/>
+                <w:sz w:val="18"/>
+              </w:rPr>
+              <w:t>Does the model generalize to a second clinic, time period or source?</w:t>
+            </w:r>
+          </w:p>
+        </w:tc>
+        <w:tc>
+          <w:tcPr>
+            <w:tcW w:type="dxa" w:w="3168"/>
+            <w:vAlign w:val="center"/>
+          </w:tcPr>
+          <w:p>
+            <w:pPr>
+              <w:spacing w:after="0"/>
+            </w:pPr>
+            <w:r/>
+            <w:r>
+              <w:rPr>
+                <w:rFonts w:ascii="Calibri" w:hAnsi="Calibri"/>
+                <w:b w:val="0"/>
+                <w:sz w:val="18"/>
+              </w:rPr>
+              <w:t>External source or temporal split.</w:t>
+            </w:r>
+          </w:p>
+        </w:tc>
+      </w:tr>
+      <w:tr>
+        <w:tc>
+          <w:tcPr>
+            <w:tcW w:type="dxa" w:w="792"/>
+            <w:vAlign w:val="center"/>
+          </w:tcPr>
+          <w:p>
+            <w:pPr>
+              <w:spacing w:after="0"/>
+            </w:pPr>
+            <w:r/>
+            <w:r>
+              <w:rPr>
+                <w:rFonts w:ascii="Calibri" w:hAnsi="Calibri"/>
+                <w:b w:val="0"/>
+                <w:sz w:val="18"/>
+              </w:rPr>
+              <w:t>RQ9</w:t>
+            </w:r>
+          </w:p>
+        </w:tc>
+        <w:tc>
+          <w:tcPr>
+            <w:tcW w:type="dxa" w:w="5112"/>
+            <w:vAlign w:val="center"/>
+          </w:tcPr>
+          <w:p>
+            <w:pPr>
+              <w:spacing w:after="0"/>
+            </w:pPr>
+            <w:r/>
+            <w:r>
+              <w:rPr>
+                <w:rFonts w:ascii="Calibri" w:hAnsi="Calibri"/>
+                <w:b w:val="0"/>
+                <w:sz w:val="18"/>
+              </w:rPr>
+              <w:t>Are clinician-facing explanations understandable and useful?</w:t>
+            </w:r>
+          </w:p>
+        </w:tc>
+        <w:tc>
+          <w:tcPr>
+            <w:tcW w:type="dxa" w:w="3168"/>
+            <w:vAlign w:val="center"/>
+          </w:tcPr>
+          <w:p>
+            <w:pPr>
+              <w:spacing w:after="0"/>
+            </w:pPr>
+            <w:r/>
+            <w:r>
+              <w:rPr>
+                <w:rFonts w:ascii="Calibri" w:hAnsi="Calibri"/>
+                <w:b w:val="0"/>
+                <w:sz w:val="18"/>
+              </w:rPr>
+              <w:t>Clinician review protocol plus explanation outputs.</w:t>
+            </w:r>
+          </w:p>
+        </w:tc>
+      </w:tr>
+    </w:tbl>
+    <w:p/>
     <w:p>
       <w:pPr>
-        <w:pStyle w:val="ListNumber"/>
+        <w:pStyle w:val="Heading1"/>
       </w:pPr>
       <w:r>
-        <w:t>How can explainable AI show the main reasons behind each prediction?</w:t>
+        <w:t>Research Questions By Dataset Scenario</w:t>
       </w:r>
     </w:p>
-    <w:p>
-      <w:pPr>
-        <w:pStyle w:val="ListNumber"/>
-      </w:pPr>
-      <w:r>
-        <w:t>Does the model perform consistently across patient groups, clinics or Indian IVF data if such data are available?</w:t>
-      </w:r>
-    </w:p>
-    <w:p>
-      <w:pPr>
-        <w:pStyle w:val="ListNumber"/>
-      </w:pPr>
-      <w:r>
-        <w:t>How can prediction results be presented to doctors as decision support without replacing doctor judgment?</w:t>
-      </w:r>
-    </w:p>
+    <w:tbl>
+      <w:tblPr>
+        <w:tblStyle w:val="TableGrid"/>
+        <w:tblW w:type="auto" w:w="0"/>
+        <w:jc w:val="center"/>
+        <w:tblLook w:firstColumn="1" w:firstRow="1" w:lastColumn="0" w:lastRow="0" w:noHBand="0" w:noVBand="1" w:val="04A0"/>
+      </w:tblPr>
+      <w:tblGrid>
+        <w:gridCol w:w="3120"/>
+        <w:gridCol w:w="3120"/>
+        <w:gridCol w:w="3120"/>
+      </w:tblGrid>
+      <w:tr>
+        <w:tc>
+          <w:tcPr>
+            <w:tcW w:type="dxa" w:w="2376"/>
+            <w:shd w:fill="F2F4F7"/>
+            <w:vAlign w:val="center"/>
+          </w:tcPr>
+          <w:p>
+            <w:pPr>
+              <w:spacing w:after="0"/>
+            </w:pPr>
+            <w:r/>
+            <w:r>
+              <w:rPr>
+                <w:rFonts w:ascii="Calibri" w:hAnsi="Calibri"/>
+                <w:b/>
+                <w:sz w:val="18"/>
+              </w:rPr>
+              <w:t>Dataset Scenario</w:t>
+            </w:r>
+          </w:p>
+        </w:tc>
+        <w:tc>
+          <w:tcPr>
+            <w:tcW w:type="dxa" w:w="3384"/>
+            <w:shd w:fill="F2F4F7"/>
+            <w:vAlign w:val="center"/>
+          </w:tcPr>
+          <w:p>
+            <w:pPr>
+              <w:spacing w:after="0"/>
+            </w:pPr>
+            <w:r/>
+            <w:r>
+              <w:rPr>
+                <w:rFonts w:ascii="Calibri" w:hAnsi="Calibri"/>
+                <w:b/>
+                <w:sz w:val="18"/>
+              </w:rPr>
+              <w:t>Suitable RQs</w:t>
+            </w:r>
+          </w:p>
+        </w:tc>
+        <w:tc>
+          <w:tcPr>
+            <w:tcW w:type="dxa" w:w="3312"/>
+            <w:shd w:fill="F2F4F7"/>
+            <w:vAlign w:val="center"/>
+          </w:tcPr>
+          <w:p>
+            <w:pPr>
+              <w:spacing w:after="0"/>
+            </w:pPr>
+            <w:r/>
+            <w:r>
+              <w:rPr>
+                <w:rFonts w:ascii="Calibri" w:hAnsi="Calibri"/>
+                <w:b/>
+                <w:sz w:val="18"/>
+              </w:rPr>
+              <w:t>Avoid</w:t>
+            </w:r>
+          </w:p>
+        </w:tc>
+      </w:tr>
+      <w:tr>
+        <w:tc>
+          <w:tcPr>
+            <w:tcW w:type="dxa" w:w="2376"/>
+            <w:vAlign w:val="center"/>
+          </w:tcPr>
+          <w:p>
+            <w:pPr>
+              <w:spacing w:after="0"/>
+            </w:pPr>
+            <w:r/>
+            <w:r>
+              <w:rPr>
+                <w:rFonts w:ascii="Calibri" w:hAnsi="Calibri"/>
+                <w:b w:val="0"/>
+                <w:sz w:val="18"/>
+              </w:rPr>
+              <w:t>Clinical data only</w:t>
+            </w:r>
+          </w:p>
+        </w:tc>
+        <w:tc>
+          <w:tcPr>
+            <w:tcW w:type="dxa" w:w="3384"/>
+            <w:vAlign w:val="center"/>
+          </w:tcPr>
+          <w:p>
+            <w:pPr>
+              <w:spacing w:after="0"/>
+            </w:pPr>
+            <w:r/>
+            <w:r>
+              <w:rPr>
+                <w:rFonts w:ascii="Calibri" w:hAnsi="Calibri"/>
+                <w:b w:val="0"/>
+                <w:sz w:val="18"/>
+              </w:rPr>
+              <w:t>RQ1, RQ2, RQ5, RQ6, selected subgroup RQs.</w:t>
+            </w:r>
+          </w:p>
+        </w:tc>
+        <w:tc>
+          <w:tcPr>
+            <w:tcW w:type="dxa" w:w="3312"/>
+            <w:vAlign w:val="center"/>
+          </w:tcPr>
+          <w:p>
+            <w:pPr>
+              <w:spacing w:after="0"/>
+            </w:pPr>
+            <w:r/>
+            <w:r>
+              <w:rPr>
+                <w:rFonts w:ascii="Calibri" w:hAnsi="Calibri"/>
+                <w:b w:val="0"/>
+                <w:sz w:val="18"/>
+              </w:rPr>
+              <w:t>Embryology, lifestyle or external validation claims.</w:t>
+            </w:r>
+          </w:p>
+        </w:tc>
+      </w:tr>
+      <w:tr>
+        <w:tc>
+          <w:tcPr>
+            <w:tcW w:type="dxa" w:w="2376"/>
+            <w:vAlign w:val="center"/>
+          </w:tcPr>
+          <w:p>
+            <w:pPr>
+              <w:spacing w:after="0"/>
+            </w:pPr>
+            <w:r/>
+            <w:r>
+              <w:rPr>
+                <w:rFonts w:ascii="Calibri" w:hAnsi="Calibri"/>
+                <w:b w:val="0"/>
+                <w:sz w:val="18"/>
+              </w:rPr>
+              <w:t>Clinical + embryology</w:t>
+            </w:r>
+          </w:p>
+        </w:tc>
+        <w:tc>
+          <w:tcPr>
+            <w:tcW w:type="dxa" w:w="3384"/>
+            <w:vAlign w:val="center"/>
+          </w:tcPr>
+          <w:p>
+            <w:pPr>
+              <w:spacing w:after="0"/>
+            </w:pPr>
+            <w:r/>
+            <w:r>
+              <w:rPr>
+                <w:rFonts w:ascii="Calibri" w:hAnsi="Calibri"/>
+                <w:b w:val="0"/>
+                <w:sz w:val="18"/>
+              </w:rPr>
+              <w:t>RQ1, RQ2, RQ3, RQ5, RQ6, RQ7.</w:t>
+            </w:r>
+          </w:p>
+        </w:tc>
+        <w:tc>
+          <w:tcPr>
+            <w:tcW w:type="dxa" w:w="3312"/>
+            <w:vAlign w:val="center"/>
+          </w:tcPr>
+          <w:p>
+            <w:pPr>
+              <w:spacing w:after="0"/>
+            </w:pPr>
+            <w:r/>
+            <w:r>
+              <w:rPr>
+                <w:rFonts w:ascii="Calibri" w:hAnsi="Calibri"/>
+                <w:b w:val="0"/>
+                <w:sz w:val="18"/>
+              </w:rPr>
+              <w:t>Lifestyle claims unless lifestyle data exists.</w:t>
+            </w:r>
+          </w:p>
+        </w:tc>
+      </w:tr>
+      <w:tr>
+        <w:tc>
+          <w:tcPr>
+            <w:tcW w:type="dxa" w:w="2376"/>
+            <w:vAlign w:val="center"/>
+          </w:tcPr>
+          <w:p>
+            <w:pPr>
+              <w:spacing w:after="0"/>
+            </w:pPr>
+            <w:r/>
+            <w:r>
+              <w:rPr>
+                <w:rFonts w:ascii="Calibri" w:hAnsi="Calibri"/>
+                <w:b w:val="0"/>
+                <w:sz w:val="18"/>
+              </w:rPr>
+              <w:t>Clinical + lifestyle</w:t>
+            </w:r>
+          </w:p>
+        </w:tc>
+        <w:tc>
+          <w:tcPr>
+            <w:tcW w:type="dxa" w:w="3384"/>
+            <w:vAlign w:val="center"/>
+          </w:tcPr>
+          <w:p>
+            <w:pPr>
+              <w:spacing w:after="0"/>
+            </w:pPr>
+            <w:r/>
+            <w:r>
+              <w:rPr>
+                <w:rFonts w:ascii="Calibri" w:hAnsi="Calibri"/>
+                <w:b w:val="0"/>
+                <w:sz w:val="18"/>
+              </w:rPr>
+              <w:t>RQ1, RQ2, RQ4, RQ5, RQ6.</w:t>
+            </w:r>
+          </w:p>
+        </w:tc>
+        <w:tc>
+          <w:tcPr>
+            <w:tcW w:type="dxa" w:w="3312"/>
+            <w:vAlign w:val="center"/>
+          </w:tcPr>
+          <w:p>
+            <w:pPr>
+              <w:spacing w:after="0"/>
+            </w:pPr>
+            <w:r/>
+            <w:r>
+              <w:rPr>
+                <w:rFonts w:ascii="Calibri" w:hAnsi="Calibri"/>
+                <w:b w:val="0"/>
+                <w:sz w:val="18"/>
+              </w:rPr>
+              <w:t>Embryology claims unless embryo data exists.</w:t>
+            </w:r>
+          </w:p>
+        </w:tc>
+      </w:tr>
+      <w:tr>
+        <w:tc>
+          <w:tcPr>
+            <w:tcW w:type="dxa" w:w="2376"/>
+            <w:vAlign w:val="center"/>
+          </w:tcPr>
+          <w:p>
+            <w:pPr>
+              <w:spacing w:after="0"/>
+            </w:pPr>
+            <w:r/>
+            <w:r>
+              <w:rPr>
+                <w:rFonts w:ascii="Calibri" w:hAnsi="Calibri"/>
+                <w:b w:val="0"/>
+                <w:sz w:val="18"/>
+              </w:rPr>
+              <w:t>Independent validation data</w:t>
+            </w:r>
+          </w:p>
+        </w:tc>
+        <w:tc>
+          <w:tcPr>
+            <w:tcW w:type="dxa" w:w="3384"/>
+            <w:vAlign w:val="center"/>
+          </w:tcPr>
+          <w:p>
+            <w:pPr>
+              <w:spacing w:after="0"/>
+            </w:pPr>
+            <w:r/>
+            <w:r>
+              <w:rPr>
+                <w:rFonts w:ascii="Calibri" w:hAnsi="Calibri"/>
+                <w:b w:val="0"/>
+                <w:sz w:val="18"/>
+              </w:rPr>
+              <w:t>RQ8 plus relevant model RQs.</w:t>
+            </w:r>
+          </w:p>
+        </w:tc>
+        <w:tc>
+          <w:tcPr>
+            <w:tcW w:type="dxa" w:w="3312"/>
+            <w:vAlign w:val="center"/>
+          </w:tcPr>
+          <w:p>
+            <w:pPr>
+              <w:spacing w:after="0"/>
+            </w:pPr>
+            <w:r/>
+            <w:r>
+              <w:rPr>
+                <w:rFonts w:ascii="Calibri" w:hAnsi="Calibri"/>
+                <w:b w:val="0"/>
+                <w:sz w:val="18"/>
+              </w:rPr>
+              <w:t>Broad generalization beyond available sources.</w:t>
+            </w:r>
+          </w:p>
+        </w:tc>
+      </w:tr>
+      <w:tr>
+        <w:tc>
+          <w:tcPr>
+            <w:tcW w:type="dxa" w:w="2376"/>
+            <w:vAlign w:val="center"/>
+          </w:tcPr>
+          <w:p>
+            <w:pPr>
+              <w:spacing w:after="0"/>
+            </w:pPr>
+            <w:r/>
+            <w:r>
+              <w:rPr>
+                <w:rFonts w:ascii="Calibri" w:hAnsi="Calibri"/>
+                <w:b w:val="0"/>
+                <w:sz w:val="18"/>
+              </w:rPr>
+              <w:t>Clinician review possible</w:t>
+            </w:r>
+          </w:p>
+        </w:tc>
+        <w:tc>
+          <w:tcPr>
+            <w:tcW w:type="dxa" w:w="3384"/>
+            <w:vAlign w:val="center"/>
+          </w:tcPr>
+          <w:p>
+            <w:pPr>
+              <w:spacing w:after="0"/>
+            </w:pPr>
+            <w:r/>
+            <w:r>
+              <w:rPr>
+                <w:rFonts w:ascii="Calibri" w:hAnsi="Calibri"/>
+                <w:b w:val="0"/>
+                <w:sz w:val="18"/>
+              </w:rPr>
+              <w:t>RQ9 plus XAI usefulness questions.</w:t>
+            </w:r>
+          </w:p>
+        </w:tc>
+        <w:tc>
+          <w:tcPr>
+            <w:tcW w:type="dxa" w:w="3312"/>
+            <w:vAlign w:val="center"/>
+          </w:tcPr>
+          <w:p>
+            <w:pPr>
+              <w:spacing w:after="0"/>
+            </w:pPr>
+            <w:r/>
+            <w:r>
+              <w:rPr>
+                <w:rFonts w:ascii="Calibri" w:hAnsi="Calibri"/>
+                <w:b w:val="0"/>
+                <w:sz w:val="18"/>
+              </w:rPr>
+              <w:t>Claims of clinician usefulness without review.</w:t>
+            </w:r>
+          </w:p>
+        </w:tc>
+      </w:tr>
+      <w:tr>
+        <w:tc>
+          <w:tcPr>
+            <w:tcW w:type="dxa" w:w="2376"/>
+            <w:vAlign w:val="center"/>
+          </w:tcPr>
+          <w:p>
+            <w:pPr>
+              <w:spacing w:after="0"/>
+            </w:pPr>
+            <w:r/>
+            <w:r>
+              <w:rPr>
+                <w:rFonts w:ascii="Calibri" w:hAnsi="Calibri"/>
+                <w:b w:val="0"/>
+                <w:sz w:val="18"/>
+              </w:rPr>
+              <w:t>Live birth unavailable</w:t>
+            </w:r>
+          </w:p>
+        </w:tc>
+        <w:tc>
+          <w:tcPr>
+            <w:tcW w:type="dxa" w:w="3384"/>
+            <w:vAlign w:val="center"/>
+          </w:tcPr>
+          <w:p>
+            <w:pPr>
+              <w:spacing w:after="0"/>
+            </w:pPr>
+            <w:r/>
+            <w:r>
+              <w:rPr>
+                <w:rFonts w:ascii="Calibri" w:hAnsi="Calibri"/>
+                <w:b w:val="0"/>
+                <w:sz w:val="18"/>
+              </w:rPr>
+              <w:t>Clinical pregnancy version of RQs.</w:t>
+            </w:r>
+          </w:p>
+        </w:tc>
+        <w:tc>
+          <w:tcPr>
+            <w:tcW w:type="dxa" w:w="3312"/>
+            <w:vAlign w:val="center"/>
+          </w:tcPr>
+          <w:p>
+            <w:pPr>
+              <w:spacing w:after="0"/>
+            </w:pPr>
+            <w:r/>
+            <w:r>
+              <w:rPr>
+                <w:rFonts w:ascii="Calibri" w:hAnsi="Calibri"/>
+                <w:b w:val="0"/>
+                <w:sz w:val="18"/>
+              </w:rPr>
+              <w:t>Live-birth prediction claims.</w:t>
+            </w:r>
+          </w:p>
+        </w:tc>
+      </w:tr>
+    </w:tbl>
+    <w:p/>
     <w:p>
       <w:pPr>
         <w:pStyle w:val="Heading1"/>
@@ -91,13 +1435,15 @@
         <w:tblLook w:firstColumn="1" w:firstRow="1" w:lastColumn="0" w:lastRow="0" w:noHBand="0" w:noVBand="1" w:val="04A0"/>
       </w:tblPr>
       <w:tblGrid>
-        <w:gridCol w:w="4680"/>
-        <w:gridCol w:w="4680"/>
+        <w:gridCol w:w="2340"/>
+        <w:gridCol w:w="2340"/>
+        <w:gridCol w:w="2340"/>
+        <w:gridCol w:w="2340"/>
       </w:tblGrid>
       <w:tr>
         <w:tc>
           <w:tcPr>
-            <w:tcW w:type="dxa" w:w="5472"/>
+            <w:tcW w:type="dxa" w:w="648"/>
             <w:shd w:fill="F2F4F7"/>
             <w:vAlign w:val="center"/>
           </w:tcPr>
@@ -112,13 +1458,13 @@
                 <w:b/>
                 <w:sz w:val="18"/>
               </w:rPr>
-              <w:t>Hypothesis</w:t>
+              <w:t>H</w:t>
             </w:r>
           </w:p>
         </w:tc>
         <w:tc>
           <w:tcPr>
-            <w:tcW w:type="dxa" w:w="3600"/>
+            <w:tcW w:type="dxa" w:w="3744"/>
             <w:shd w:fill="F2F4F7"/>
             <w:vAlign w:val="center"/>
           </w:tcPr>
@@ -133,7 +1479,49 @@
                 <w:b/>
                 <w:sz w:val="18"/>
               </w:rPr>
-              <w:t>Status</w:t>
+              <w:t>Tentative Hypothesis</w:t>
+            </w:r>
+          </w:p>
+        </w:tc>
+        <w:tc>
+          <w:tcPr>
+            <w:tcW w:type="dxa" w:w="2448"/>
+            <w:shd w:fill="F2F4F7"/>
+            <w:vAlign w:val="center"/>
+          </w:tcPr>
+          <w:p>
+            <w:pPr>
+              <w:spacing w:after="0"/>
+            </w:pPr>
+            <w:r/>
+            <w:r>
+              <w:rPr>
+                <w:rFonts w:ascii="Calibri" w:hAnsi="Calibri"/>
+                <w:b/>
+                <w:sz w:val="18"/>
+              </w:rPr>
+              <w:t>Required Data</w:t>
+            </w:r>
+          </w:p>
+        </w:tc>
+        <w:tc>
+          <w:tcPr>
+            <w:tcW w:type="dxa" w:w="2232"/>
+            <w:shd w:fill="F2F4F7"/>
+            <w:vAlign w:val="center"/>
+          </w:tcPr>
+          <w:p>
+            <w:pPr>
+              <w:spacing w:after="0"/>
+            </w:pPr>
+            <w:r/>
+            <w:r>
+              <w:rPr>
+                <w:rFonts w:ascii="Calibri" w:hAnsi="Calibri"/>
+                <w:b/>
+                <w:sz w:val="18"/>
+              </w:rPr>
+              <w:t>Evaluation</w:t>
             </w:r>
           </w:p>
         </w:tc>
@@ -141,7 +1529,7 @@
       <w:tr>
         <w:tc>
           <w:tcPr>
-            <w:tcW w:type="dxa" w:w="5472"/>
+            <w:tcW w:type="dxa" w:w="648"/>
             <w:vAlign w:val="center"/>
           </w:tcPr>
           <w:p>
@@ -155,13 +1543,13 @@
                 <w:b w:val="0"/>
                 <w:sz w:val="18"/>
               </w:rPr>
-              <w:t>Clinical and embryological variables together improve prediction compared with clinical variables alone.</w:t>
+              <w:t>H1</w:t>
             </w:r>
           </w:p>
         </w:tc>
         <w:tc>
           <w:tcPr>
-            <w:tcW w:type="dxa" w:w="3600"/>
+            <w:tcW w:type="dxa" w:w="3744"/>
             <w:vAlign w:val="center"/>
           </w:tcPr>
           <w:p>
@@ -175,15 +1563,13 @@
                 <w:b w:val="0"/>
                 <w:sz w:val="18"/>
               </w:rPr>
-              <w:t>Testable only if embryology variables are available.</w:t>
+              <w:t>Clinical variables can predict the selected IVF outcome better than chance.</w:t>
             </w:r>
           </w:p>
         </w:tc>
-      </w:tr>
-      <w:tr>
         <w:tc>
           <w:tcPr>
-            <w:tcW w:type="dxa" w:w="5472"/>
+            <w:tcW w:type="dxa" w:w="2448"/>
             <w:vAlign w:val="center"/>
           </w:tcPr>
           <w:p>
@@ -197,13 +1583,13 @@
                 <w:b w:val="0"/>
                 <w:sz w:val="18"/>
               </w:rPr>
-              <w:t>XAI can identify patient-specific positive and negative prediction drivers.</w:t>
+              <w:t>Clinical predictors plus outcome.</w:t>
             </w:r>
           </w:p>
         </w:tc>
         <w:tc>
           <w:tcPr>
-            <w:tcW w:type="dxa" w:w="3600"/>
+            <w:tcW w:type="dxa" w:w="2232"/>
             <w:vAlign w:val="center"/>
           </w:tcPr>
           <w:p>
@@ -217,7 +1603,7 @@
                 <w:b w:val="0"/>
                 <w:sz w:val="18"/>
               </w:rPr>
-              <w:t>Testable after model development.</w:t>
+              <w:t>AUC with confidence interval; baseline model.</w:t>
             </w:r>
           </w:p>
         </w:tc>
@@ -225,7 +1611,7 @@
       <w:tr>
         <w:tc>
           <w:tcPr>
-            <w:tcW w:type="dxa" w:w="5472"/>
+            <w:tcW w:type="dxa" w:w="648"/>
             <w:vAlign w:val="center"/>
           </w:tcPr>
           <w:p>
@@ -239,13 +1625,13 @@
                 <w:b w:val="0"/>
                 <w:sz w:val="18"/>
               </w:rPr>
-              <w:t>Model performance differs across age, diagnosis or treatment subgroups.</w:t>
+              <w:t>H2</w:t>
             </w:r>
           </w:p>
         </w:tc>
         <w:tc>
           <w:tcPr>
-            <w:tcW w:type="dxa" w:w="3600"/>
+            <w:tcW w:type="dxa" w:w="3744"/>
             <w:vAlign w:val="center"/>
           </w:tcPr>
           <w:p>
@@ -259,15 +1645,13 @@
                 <w:b w:val="0"/>
                 <w:sz w:val="18"/>
               </w:rPr>
-              <w:t>Testable if subgroup sizes are adequate.</w:t>
+              <w:t>An advanced ML model improves prediction compared with logistic regression.</w:t>
             </w:r>
           </w:p>
         </w:tc>
-      </w:tr>
-      <w:tr>
         <w:tc>
           <w:tcPr>
-            <w:tcW w:type="dxa" w:w="5472"/>
+            <w:tcW w:type="dxa" w:w="2448"/>
             <w:vAlign w:val="center"/>
           </w:tcPr>
           <w:p>
@@ -281,13 +1665,13 @@
                 <w:b w:val="0"/>
                 <w:sz w:val="18"/>
               </w:rPr>
-              <w:t>Clinicians find structured explanation outputs useful for counseling.</w:t>
+              <w:t>Adequate sample size and outcome balance.</w:t>
             </w:r>
           </w:p>
         </w:tc>
         <w:tc>
           <w:tcPr>
-            <w:tcW w:type="dxa" w:w="3600"/>
+            <w:tcW w:type="dxa" w:w="2232"/>
             <w:vAlign w:val="center"/>
           </w:tcPr>
           <w:p>
@@ -301,7 +1685,1355 @@
                 <w:b w:val="0"/>
                 <w:sz w:val="18"/>
               </w:rPr>
-              <w:t>Testable only if clinician review is feasible.</w:t>
+              <w:t>AUC, calibration, Brier score, cross-validation/test-set comparison.</w:t>
+            </w:r>
+          </w:p>
+        </w:tc>
+      </w:tr>
+      <w:tr>
+        <w:tc>
+          <w:tcPr>
+            <w:tcW w:type="dxa" w:w="648"/>
+            <w:vAlign w:val="center"/>
+          </w:tcPr>
+          <w:p>
+            <w:pPr>
+              <w:spacing w:after="0"/>
+            </w:pPr>
+            <w:r/>
+            <w:r>
+              <w:rPr>
+                <w:rFonts w:ascii="Calibri" w:hAnsi="Calibri"/>
+                <w:b w:val="0"/>
+                <w:sz w:val="18"/>
+              </w:rPr>
+              <w:t>H3</w:t>
+            </w:r>
+          </w:p>
+        </w:tc>
+        <w:tc>
+          <w:tcPr>
+            <w:tcW w:type="dxa" w:w="3744"/>
+            <w:vAlign w:val="center"/>
+          </w:tcPr>
+          <w:p>
+            <w:pPr>
+              <w:spacing w:after="0"/>
+            </w:pPr>
+            <w:r/>
+            <w:r>
+              <w:rPr>
+                <w:rFonts w:ascii="Calibri" w:hAnsi="Calibri"/>
+                <w:b w:val="0"/>
+                <w:sz w:val="18"/>
+              </w:rPr>
+              <w:t>Adding embryology variables improves prediction over clinical variables alone.</w:t>
+            </w:r>
+          </w:p>
+        </w:tc>
+        <w:tc>
+          <w:tcPr>
+            <w:tcW w:type="dxa" w:w="2448"/>
+            <w:vAlign w:val="center"/>
+          </w:tcPr>
+          <w:p>
+            <w:pPr>
+              <w:spacing w:after="0"/>
+            </w:pPr>
+            <w:r/>
+            <w:r>
+              <w:rPr>
+                <w:rFonts w:ascii="Calibri" w:hAnsi="Calibri"/>
+                <w:b w:val="0"/>
+                <w:sz w:val="18"/>
+              </w:rPr>
+              <w:t>Clinical plus embryology variables.</w:t>
+            </w:r>
+          </w:p>
+        </w:tc>
+        <w:tc>
+          <w:tcPr>
+            <w:tcW w:type="dxa" w:w="2232"/>
+            <w:vAlign w:val="center"/>
+          </w:tcPr>
+          <w:p>
+            <w:pPr>
+              <w:spacing w:after="0"/>
+            </w:pPr>
+            <w:r/>
+            <w:r>
+              <w:rPr>
+                <w:rFonts w:ascii="Calibri" w:hAnsi="Calibri"/>
+                <w:b w:val="0"/>
+                <w:sz w:val="18"/>
+              </w:rPr>
+              <w:t>Model comparison, calibration and net benefit if feasible.</w:t>
+            </w:r>
+          </w:p>
+        </w:tc>
+      </w:tr>
+      <w:tr>
+        <w:tc>
+          <w:tcPr>
+            <w:tcW w:type="dxa" w:w="648"/>
+            <w:vAlign w:val="center"/>
+          </w:tcPr>
+          <w:p>
+            <w:pPr>
+              <w:spacing w:after="0"/>
+            </w:pPr>
+            <w:r/>
+            <w:r>
+              <w:rPr>
+                <w:rFonts w:ascii="Calibri" w:hAnsi="Calibri"/>
+                <w:b w:val="0"/>
+                <w:sz w:val="18"/>
+              </w:rPr>
+              <w:t>H4</w:t>
+            </w:r>
+          </w:p>
+        </w:tc>
+        <w:tc>
+          <w:tcPr>
+            <w:tcW w:type="dxa" w:w="3744"/>
+            <w:vAlign w:val="center"/>
+          </w:tcPr>
+          <w:p>
+            <w:pPr>
+              <w:spacing w:after="0"/>
+            </w:pPr>
+            <w:r/>
+            <w:r>
+              <w:rPr>
+                <w:rFonts w:ascii="Calibri" w:hAnsi="Calibri"/>
+                <w:b w:val="0"/>
+                <w:sz w:val="18"/>
+              </w:rPr>
+              <w:t>Lifestyle variables add predictive or personalization value beyond clinical variables.</w:t>
+            </w:r>
+          </w:p>
+        </w:tc>
+        <w:tc>
+          <w:tcPr>
+            <w:tcW w:type="dxa" w:w="2448"/>
+            <w:vAlign w:val="center"/>
+          </w:tcPr>
+          <w:p>
+            <w:pPr>
+              <w:spacing w:after="0"/>
+            </w:pPr>
+            <w:r/>
+            <w:r>
+              <w:rPr>
+                <w:rFonts w:ascii="Calibri" w:hAnsi="Calibri"/>
+                <w:b w:val="0"/>
+                <w:sz w:val="18"/>
+              </w:rPr>
+              <w:t>Reliable lifestyle data.</w:t>
+            </w:r>
+          </w:p>
+        </w:tc>
+        <w:tc>
+          <w:tcPr>
+            <w:tcW w:type="dxa" w:w="2232"/>
+            <w:vAlign w:val="center"/>
+          </w:tcPr>
+          <w:p>
+            <w:pPr>
+              <w:spacing w:after="0"/>
+            </w:pPr>
+            <w:r/>
+            <w:r>
+              <w:rPr>
+                <w:rFonts w:ascii="Calibri" w:hAnsi="Calibri"/>
+                <w:b w:val="0"/>
+                <w:sz w:val="18"/>
+              </w:rPr>
+              <w:t>Model comparison and feature contribution; avoid causality.</w:t>
+            </w:r>
+          </w:p>
+        </w:tc>
+      </w:tr>
+      <w:tr>
+        <w:tc>
+          <w:tcPr>
+            <w:tcW w:type="dxa" w:w="648"/>
+            <w:vAlign w:val="center"/>
+          </w:tcPr>
+          <w:p>
+            <w:pPr>
+              <w:spacing w:after="0"/>
+            </w:pPr>
+            <w:r/>
+            <w:r>
+              <w:rPr>
+                <w:rFonts w:ascii="Calibri" w:hAnsi="Calibri"/>
+                <w:b w:val="0"/>
+                <w:sz w:val="18"/>
+              </w:rPr>
+              <w:t>H5</w:t>
+            </w:r>
+          </w:p>
+        </w:tc>
+        <w:tc>
+          <w:tcPr>
+            <w:tcW w:type="dxa" w:w="3744"/>
+            <w:vAlign w:val="center"/>
+          </w:tcPr>
+          <w:p>
+            <w:pPr>
+              <w:spacing w:after="0"/>
+            </w:pPr>
+            <w:r/>
+            <w:r>
+              <w:rPr>
+                <w:rFonts w:ascii="Calibri" w:hAnsi="Calibri"/>
+                <w:b w:val="0"/>
+                <w:sz w:val="18"/>
+              </w:rPr>
+              <w:t>XAI identifies clinically meaningful patient-level prediction drivers.</w:t>
+            </w:r>
+          </w:p>
+        </w:tc>
+        <w:tc>
+          <w:tcPr>
+            <w:tcW w:type="dxa" w:w="2448"/>
+            <w:vAlign w:val="center"/>
+          </w:tcPr>
+          <w:p>
+            <w:pPr>
+              <w:spacing w:after="0"/>
+            </w:pPr>
+            <w:r/>
+            <w:r>
+              <w:rPr>
+                <w:rFonts w:ascii="Calibri" w:hAnsi="Calibri"/>
+                <w:b w:val="0"/>
+                <w:sz w:val="18"/>
+              </w:rPr>
+              <w:t>Trained model plus XAI outputs.</w:t>
+            </w:r>
+          </w:p>
+        </w:tc>
+        <w:tc>
+          <w:tcPr>
+            <w:tcW w:type="dxa" w:w="2232"/>
+            <w:vAlign w:val="center"/>
+          </w:tcPr>
+          <w:p>
+            <w:pPr>
+              <w:spacing w:after="0"/>
+            </w:pPr>
+            <w:r/>
+            <w:r>
+              <w:rPr>
+                <w:rFonts w:ascii="Calibri" w:hAnsi="Calibri"/>
+                <w:b w:val="0"/>
+                <w:sz w:val="18"/>
+              </w:rPr>
+              <w:t>SHAP/LIME review and clinician interpretation if available.</w:t>
+            </w:r>
+          </w:p>
+        </w:tc>
+      </w:tr>
+      <w:tr>
+        <w:tc>
+          <w:tcPr>
+            <w:tcW w:type="dxa" w:w="648"/>
+            <w:vAlign w:val="center"/>
+          </w:tcPr>
+          <w:p>
+            <w:pPr>
+              <w:spacing w:after="0"/>
+            </w:pPr>
+            <w:r/>
+            <w:r>
+              <w:rPr>
+                <w:rFonts w:ascii="Calibri" w:hAnsi="Calibri"/>
+                <w:b w:val="0"/>
+                <w:sz w:val="18"/>
+              </w:rPr>
+              <w:t>H6</w:t>
+            </w:r>
+          </w:p>
+        </w:tc>
+        <w:tc>
+          <w:tcPr>
+            <w:tcW w:type="dxa" w:w="3744"/>
+            <w:vAlign w:val="center"/>
+          </w:tcPr>
+          <w:p>
+            <w:pPr>
+              <w:spacing w:after="0"/>
+            </w:pPr>
+            <w:r/>
+            <w:r>
+              <w:rPr>
+                <w:rFonts w:ascii="Calibri" w:hAnsi="Calibri"/>
+                <w:b w:val="0"/>
+                <w:sz w:val="18"/>
+              </w:rPr>
+              <w:t>Model performance varies across important patient subgroups.</w:t>
+            </w:r>
+          </w:p>
+        </w:tc>
+        <w:tc>
+          <w:tcPr>
+            <w:tcW w:type="dxa" w:w="2448"/>
+            <w:vAlign w:val="center"/>
+          </w:tcPr>
+          <w:p>
+            <w:pPr>
+              <w:spacing w:after="0"/>
+            </w:pPr>
+            <w:r/>
+            <w:r>
+              <w:rPr>
+                <w:rFonts w:ascii="Calibri" w:hAnsi="Calibri"/>
+                <w:b w:val="0"/>
+                <w:sz w:val="18"/>
+              </w:rPr>
+              <w:t>Subgroup variables and sufficient sample.</w:t>
+            </w:r>
+          </w:p>
+        </w:tc>
+        <w:tc>
+          <w:tcPr>
+            <w:tcW w:type="dxa" w:w="2232"/>
+            <w:vAlign w:val="center"/>
+          </w:tcPr>
+          <w:p>
+            <w:pPr>
+              <w:spacing w:after="0"/>
+            </w:pPr>
+            <w:r/>
+            <w:r>
+              <w:rPr>
+                <w:rFonts w:ascii="Calibri" w:hAnsi="Calibri"/>
+                <w:b w:val="0"/>
+                <w:sz w:val="18"/>
+              </w:rPr>
+              <w:t>Stratified AUC/calibration and interaction checks.</w:t>
+            </w:r>
+          </w:p>
+        </w:tc>
+      </w:tr>
+      <w:tr>
+        <w:tc>
+          <w:tcPr>
+            <w:tcW w:type="dxa" w:w="648"/>
+            <w:vAlign w:val="center"/>
+          </w:tcPr>
+          <w:p>
+            <w:pPr>
+              <w:spacing w:after="0"/>
+            </w:pPr>
+            <w:r/>
+            <w:r>
+              <w:rPr>
+                <w:rFonts w:ascii="Calibri" w:hAnsi="Calibri"/>
+                <w:b w:val="0"/>
+                <w:sz w:val="18"/>
+              </w:rPr>
+              <w:t>H7</w:t>
+            </w:r>
+          </w:p>
+        </w:tc>
+        <w:tc>
+          <w:tcPr>
+            <w:tcW w:type="dxa" w:w="3744"/>
+            <w:vAlign w:val="center"/>
+          </w:tcPr>
+          <w:p>
+            <w:pPr>
+              <w:spacing w:after="0"/>
+            </w:pPr>
+            <w:r/>
+            <w:r>
+              <w:rPr>
+                <w:rFonts w:ascii="Calibri" w:hAnsi="Calibri"/>
+                <w:b w:val="0"/>
+                <w:sz w:val="18"/>
+              </w:rPr>
+              <w:t>The model maintains acceptable performance on independent/temporal validation data.</w:t>
+            </w:r>
+          </w:p>
+        </w:tc>
+        <w:tc>
+          <w:tcPr>
+            <w:tcW w:type="dxa" w:w="2448"/>
+            <w:vAlign w:val="center"/>
+          </w:tcPr>
+          <w:p>
+            <w:pPr>
+              <w:spacing w:after="0"/>
+            </w:pPr>
+            <w:r/>
+            <w:r>
+              <w:rPr>
+                <w:rFonts w:ascii="Calibri" w:hAnsi="Calibri"/>
+                <w:b w:val="0"/>
+                <w:sz w:val="18"/>
+              </w:rPr>
+              <w:t>Second source or later time-period data.</w:t>
+            </w:r>
+          </w:p>
+        </w:tc>
+        <w:tc>
+          <w:tcPr>
+            <w:tcW w:type="dxa" w:w="2232"/>
+            <w:vAlign w:val="center"/>
+          </w:tcPr>
+          <w:p>
+            <w:pPr>
+              <w:spacing w:after="0"/>
+            </w:pPr>
+            <w:r/>
+            <w:r>
+              <w:rPr>
+                <w:rFonts w:ascii="Calibri" w:hAnsi="Calibri"/>
+                <w:b w:val="0"/>
+                <w:sz w:val="18"/>
+              </w:rPr>
+              <w:t>External/temporal discrimination and calibration.</w:t>
+            </w:r>
+          </w:p>
+        </w:tc>
+      </w:tr>
+      <w:tr>
+        <w:tc>
+          <w:tcPr>
+            <w:tcW w:type="dxa" w:w="648"/>
+            <w:vAlign w:val="center"/>
+          </w:tcPr>
+          <w:p>
+            <w:pPr>
+              <w:spacing w:after="0"/>
+            </w:pPr>
+            <w:r/>
+            <w:r>
+              <w:rPr>
+                <w:rFonts w:ascii="Calibri" w:hAnsi="Calibri"/>
+                <w:b w:val="0"/>
+                <w:sz w:val="18"/>
+              </w:rPr>
+              <w:t>H8</w:t>
+            </w:r>
+          </w:p>
+        </w:tc>
+        <w:tc>
+          <w:tcPr>
+            <w:tcW w:type="dxa" w:w="3744"/>
+            <w:vAlign w:val="center"/>
+          </w:tcPr>
+          <w:p>
+            <w:pPr>
+              <w:spacing w:after="0"/>
+            </w:pPr>
+            <w:r/>
+            <w:r>
+              <w:rPr>
+                <w:rFonts w:ascii="Calibri" w:hAnsi="Calibri"/>
+                <w:b w:val="0"/>
+                <w:sz w:val="18"/>
+              </w:rPr>
+              <w:t>Clinician-facing explanations are perceived as useful for counseling.</w:t>
+            </w:r>
+          </w:p>
+        </w:tc>
+        <w:tc>
+          <w:tcPr>
+            <w:tcW w:type="dxa" w:w="2448"/>
+            <w:vAlign w:val="center"/>
+          </w:tcPr>
+          <w:p>
+            <w:pPr>
+              <w:spacing w:after="0"/>
+            </w:pPr>
+            <w:r/>
+            <w:r>
+              <w:rPr>
+                <w:rFonts w:ascii="Calibri" w:hAnsi="Calibri"/>
+                <w:b w:val="0"/>
+                <w:sz w:val="18"/>
+              </w:rPr>
+              <w:t>Clinician review study.</w:t>
+            </w:r>
+          </w:p>
+        </w:tc>
+        <w:tc>
+          <w:tcPr>
+            <w:tcW w:type="dxa" w:w="2232"/>
+            <w:vAlign w:val="center"/>
+          </w:tcPr>
+          <w:p>
+            <w:pPr>
+              <w:spacing w:after="0"/>
+            </w:pPr>
+            <w:r/>
+            <w:r>
+              <w:rPr>
+                <w:rFonts w:ascii="Calibri" w:hAnsi="Calibri"/>
+                <w:b w:val="0"/>
+                <w:sz w:val="18"/>
+              </w:rPr>
+              <w:t>Likert ratings, structured feedback or short interview.</w:t>
+            </w:r>
+          </w:p>
+        </w:tc>
+      </w:tr>
+    </w:tbl>
+    <w:p/>
+    <w:p>
+      <w:pPr>
+        <w:pStyle w:val="Heading1"/>
+      </w:pPr>
+      <w:r>
+        <w:t>Hypotheses To Avoid For Now</w:t>
+      </w:r>
+    </w:p>
+    <w:tbl>
+      <w:tblPr>
+        <w:tblStyle w:val="TableGrid"/>
+        <w:tblW w:type="auto" w:w="0"/>
+        <w:jc w:val="center"/>
+        <w:tblLook w:firstColumn="1" w:firstRow="1" w:lastColumn="0" w:lastRow="0" w:noHBand="0" w:noVBand="1" w:val="04A0"/>
+      </w:tblPr>
+      <w:tblGrid>
+        <w:gridCol w:w="3120"/>
+        <w:gridCol w:w="3120"/>
+        <w:gridCol w:w="3120"/>
+      </w:tblGrid>
+      <w:tr>
+        <w:tc>
+          <w:tcPr>
+            <w:tcW w:type="dxa" w:w="2592"/>
+            <w:shd w:fill="F2F4F7"/>
+            <w:vAlign w:val="center"/>
+          </w:tcPr>
+          <w:p>
+            <w:pPr>
+              <w:spacing w:after="0"/>
+            </w:pPr>
+            <w:r/>
+            <w:r>
+              <w:rPr>
+                <w:rFonts w:ascii="Calibri" w:hAnsi="Calibri"/>
+                <w:b/>
+                <w:sz w:val="18"/>
+              </w:rPr>
+              <w:t>Avoid Hypothesis</w:t>
+            </w:r>
+          </w:p>
+        </w:tc>
+        <w:tc>
+          <w:tcPr>
+            <w:tcW w:type="dxa" w:w="3096"/>
+            <w:shd w:fill="F2F4F7"/>
+            <w:vAlign w:val="center"/>
+          </w:tcPr>
+          <w:p>
+            <w:pPr>
+              <w:spacing w:after="0"/>
+            </w:pPr>
+            <w:r/>
+            <w:r>
+              <w:rPr>
+                <w:rFonts w:ascii="Calibri" w:hAnsi="Calibri"/>
+                <w:b/>
+                <w:sz w:val="18"/>
+              </w:rPr>
+              <w:t>Why Unsafe</w:t>
+            </w:r>
+          </w:p>
+        </w:tc>
+        <w:tc>
+          <w:tcPr>
+            <w:tcW w:type="dxa" w:w="3384"/>
+            <w:shd w:fill="F2F4F7"/>
+            <w:vAlign w:val="center"/>
+          </w:tcPr>
+          <w:p>
+            <w:pPr>
+              <w:spacing w:after="0"/>
+            </w:pPr>
+            <w:r/>
+            <w:r>
+              <w:rPr>
+                <w:rFonts w:ascii="Calibri" w:hAnsi="Calibri"/>
+                <w:b/>
+                <w:sz w:val="18"/>
+              </w:rPr>
+              <w:t>Safer Version</w:t>
+            </w:r>
+          </w:p>
+        </w:tc>
+      </w:tr>
+      <w:tr>
+        <w:tc>
+          <w:tcPr>
+            <w:tcW w:type="dxa" w:w="2592"/>
+            <w:vAlign w:val="center"/>
+          </w:tcPr>
+          <w:p>
+            <w:pPr>
+              <w:spacing w:after="0"/>
+            </w:pPr>
+            <w:r/>
+            <w:r>
+              <w:rPr>
+                <w:rFonts w:ascii="Calibri" w:hAnsi="Calibri"/>
+                <w:b w:val="0"/>
+                <w:sz w:val="18"/>
+              </w:rPr>
+              <w:t>The model will increase IVF success rate.</w:t>
+            </w:r>
+          </w:p>
+        </w:tc>
+        <w:tc>
+          <w:tcPr>
+            <w:tcW w:type="dxa" w:w="3096"/>
+            <w:vAlign w:val="center"/>
+          </w:tcPr>
+          <w:p>
+            <w:pPr>
+              <w:spacing w:after="0"/>
+            </w:pPr>
+            <w:r/>
+            <w:r>
+              <w:rPr>
+                <w:rFonts w:ascii="Calibri" w:hAnsi="Calibri"/>
+                <w:b w:val="0"/>
+                <w:sz w:val="18"/>
+              </w:rPr>
+              <w:t>Requires prospective clinical intervention and outcome testing.</w:t>
+            </w:r>
+          </w:p>
+        </w:tc>
+        <w:tc>
+          <w:tcPr>
+            <w:tcW w:type="dxa" w:w="3384"/>
+            <w:vAlign w:val="center"/>
+          </w:tcPr>
+          <w:p>
+            <w:pPr>
+              <w:spacing w:after="0"/>
+            </w:pPr>
+            <w:r/>
+            <w:r>
+              <w:rPr>
+                <w:rFonts w:ascii="Calibri" w:hAnsi="Calibri"/>
+                <w:b w:val="0"/>
+                <w:sz w:val="18"/>
+              </w:rPr>
+              <w:t>The model may support counseling; clinical impact needs future prospective validation.</w:t>
+            </w:r>
+          </w:p>
+        </w:tc>
+      </w:tr>
+      <w:tr>
+        <w:tc>
+          <w:tcPr>
+            <w:tcW w:type="dxa" w:w="2592"/>
+            <w:vAlign w:val="center"/>
+          </w:tcPr>
+          <w:p>
+            <w:pPr>
+              <w:spacing w:after="0"/>
+            </w:pPr>
+            <w:r/>
+            <w:r>
+              <w:rPr>
+                <w:rFonts w:ascii="Calibri" w:hAnsi="Calibri"/>
+                <w:b w:val="0"/>
+                <w:sz w:val="18"/>
+              </w:rPr>
+              <w:t>Lifestyle causes IVF failure.</w:t>
+            </w:r>
+          </w:p>
+        </w:tc>
+        <w:tc>
+          <w:tcPr>
+            <w:tcW w:type="dxa" w:w="3096"/>
+            <w:vAlign w:val="center"/>
+          </w:tcPr>
+          <w:p>
+            <w:pPr>
+              <w:spacing w:after="0"/>
+            </w:pPr>
+            <w:r/>
+            <w:r>
+              <w:rPr>
+                <w:rFonts w:ascii="Calibri" w:hAnsi="Calibri"/>
+                <w:b w:val="0"/>
+                <w:sz w:val="18"/>
+              </w:rPr>
+              <w:t>Observational prediction data cannot prove causality.</w:t>
+            </w:r>
+          </w:p>
+        </w:tc>
+        <w:tc>
+          <w:tcPr>
+            <w:tcW w:type="dxa" w:w="3384"/>
+            <w:vAlign w:val="center"/>
+          </w:tcPr>
+          <w:p>
+            <w:pPr>
+              <w:spacing w:after="0"/>
+            </w:pPr>
+            <w:r/>
+            <w:r>
+              <w:rPr>
+                <w:rFonts w:ascii="Calibri" w:hAnsi="Calibri"/>
+                <w:b w:val="0"/>
+                <w:sz w:val="18"/>
+              </w:rPr>
+              <w:t>Lifestyle variables may be associated with outcomes if measured reliably.</w:t>
+            </w:r>
+          </w:p>
+        </w:tc>
+      </w:tr>
+      <w:tr>
+        <w:tc>
+          <w:tcPr>
+            <w:tcW w:type="dxa" w:w="2592"/>
+            <w:vAlign w:val="center"/>
+          </w:tcPr>
+          <w:p>
+            <w:pPr>
+              <w:spacing w:after="0"/>
+            </w:pPr>
+            <w:r/>
+            <w:r>
+              <w:rPr>
+                <w:rFonts w:ascii="Calibri" w:hAnsi="Calibri"/>
+                <w:b w:val="0"/>
+                <w:sz w:val="18"/>
+              </w:rPr>
+              <w:t>XAI will make doctors trust the model.</w:t>
+            </w:r>
+          </w:p>
+        </w:tc>
+        <w:tc>
+          <w:tcPr>
+            <w:tcW w:type="dxa" w:w="3096"/>
+            <w:vAlign w:val="center"/>
+          </w:tcPr>
+          <w:p>
+            <w:pPr>
+              <w:spacing w:after="0"/>
+            </w:pPr>
+            <w:r/>
+            <w:r>
+              <w:rPr>
+                <w:rFonts w:ascii="Calibri" w:hAnsi="Calibri"/>
+                <w:b w:val="0"/>
+                <w:sz w:val="18"/>
+              </w:rPr>
+              <w:t>Trust must be measured, not assumed.</w:t>
+            </w:r>
+          </w:p>
+        </w:tc>
+        <w:tc>
+          <w:tcPr>
+            <w:tcW w:type="dxa" w:w="3384"/>
+            <w:vAlign w:val="center"/>
+          </w:tcPr>
+          <w:p>
+            <w:pPr>
+              <w:spacing w:after="0"/>
+            </w:pPr>
+            <w:r/>
+            <w:r>
+              <w:rPr>
+                <w:rFonts w:ascii="Calibri" w:hAnsi="Calibri"/>
+                <w:b w:val="0"/>
+                <w:sz w:val="18"/>
+              </w:rPr>
+              <w:t>Clinicians can rate explanation usefulness and understandability.</w:t>
+            </w:r>
+          </w:p>
+        </w:tc>
+      </w:tr>
+      <w:tr>
+        <w:tc>
+          <w:tcPr>
+            <w:tcW w:type="dxa" w:w="2592"/>
+            <w:vAlign w:val="center"/>
+          </w:tcPr>
+          <w:p>
+            <w:pPr>
+              <w:spacing w:after="0"/>
+            </w:pPr>
+            <w:r/>
+            <w:r>
+              <w:rPr>
+                <w:rFonts w:ascii="Calibri" w:hAnsi="Calibri"/>
+                <w:b w:val="0"/>
+                <w:sz w:val="18"/>
+              </w:rPr>
+              <w:t>The model works for all Indian IVF clinics.</w:t>
+            </w:r>
+          </w:p>
+        </w:tc>
+        <w:tc>
+          <w:tcPr>
+            <w:tcW w:type="dxa" w:w="3096"/>
+            <w:vAlign w:val="center"/>
+          </w:tcPr>
+          <w:p>
+            <w:pPr>
+              <w:spacing w:after="0"/>
+            </w:pPr>
+            <w:r/>
+            <w:r>
+              <w:rPr>
+                <w:rFonts w:ascii="Calibri" w:hAnsi="Calibri"/>
+                <w:b w:val="0"/>
+                <w:sz w:val="18"/>
+              </w:rPr>
+              <w:t>Requires broad multi-center Indian validation.</w:t>
+            </w:r>
+          </w:p>
+        </w:tc>
+        <w:tc>
+          <w:tcPr>
+            <w:tcW w:type="dxa" w:w="3384"/>
+            <w:vAlign w:val="center"/>
+          </w:tcPr>
+          <w:p>
+            <w:pPr>
+              <w:spacing w:after="0"/>
+            </w:pPr>
+            <w:r/>
+            <w:r>
+              <w:rPr>
+                <w:rFonts w:ascii="Calibri" w:hAnsi="Calibri"/>
+                <w:b w:val="0"/>
+                <w:sz w:val="18"/>
+              </w:rPr>
+              <w:t>The model can be tested on available Indian data and limitations stated.</w:t>
+            </w:r>
+          </w:p>
+        </w:tc>
+      </w:tr>
+      <w:tr>
+        <w:tc>
+          <w:tcPr>
+            <w:tcW w:type="dxa" w:w="2592"/>
+            <w:vAlign w:val="center"/>
+          </w:tcPr>
+          <w:p>
+            <w:pPr>
+              <w:spacing w:after="0"/>
+            </w:pPr>
+            <w:r/>
+            <w:r>
+              <w:rPr>
+                <w:rFonts w:ascii="Calibri" w:hAnsi="Calibri"/>
+                <w:b w:val="0"/>
+                <w:sz w:val="18"/>
+              </w:rPr>
+              <w:t>Deep learning will be superior.</w:t>
+            </w:r>
+          </w:p>
+        </w:tc>
+        <w:tc>
+          <w:tcPr>
+            <w:tcW w:type="dxa" w:w="3096"/>
+            <w:vAlign w:val="center"/>
+          </w:tcPr>
+          <w:p>
+            <w:pPr>
+              <w:spacing w:after="0"/>
+            </w:pPr>
+            <w:r/>
+            <w:r>
+              <w:rPr>
+                <w:rFonts w:ascii="Calibri" w:hAnsi="Calibri"/>
+                <w:b w:val="0"/>
+                <w:sz w:val="18"/>
+              </w:rPr>
+              <w:t>Depends on data type and sample size.</w:t>
+            </w:r>
+          </w:p>
+        </w:tc>
+        <w:tc>
+          <w:tcPr>
+            <w:tcW w:type="dxa" w:w="3384"/>
+            <w:vAlign w:val="center"/>
+          </w:tcPr>
+          <w:p>
+            <w:pPr>
+              <w:spacing w:after="0"/>
+            </w:pPr>
+            <w:r/>
+            <w:r>
+              <w:rPr>
+                <w:rFonts w:ascii="Calibri" w:hAnsi="Calibri"/>
+                <w:b w:val="0"/>
+                <w:sz w:val="18"/>
+              </w:rPr>
+              <w:t>Deep learning may be considered only if data justifies it.</w:t>
+            </w:r>
+          </w:p>
+        </w:tc>
+      </w:tr>
+    </w:tbl>
+    <w:p/>
+    <w:p>
+      <w:pPr>
+        <w:pStyle w:val="Heading1"/>
+      </w:pPr>
+      <w:r>
+        <w:t>Objective To RQ Mapping</w:t>
+      </w:r>
+    </w:p>
+    <w:tbl>
+      <w:tblPr>
+        <w:tblStyle w:val="TableGrid"/>
+        <w:tblW w:type="auto" w:w="0"/>
+        <w:jc w:val="center"/>
+        <w:tblLook w:firstColumn="1" w:firstRow="1" w:lastColumn="0" w:lastRow="0" w:noHBand="0" w:noVBand="1" w:val="04A0"/>
+      </w:tblPr>
+      <w:tblGrid>
+        <w:gridCol w:w="3120"/>
+        <w:gridCol w:w="3120"/>
+        <w:gridCol w:w="3120"/>
+      </w:tblGrid>
+      <w:tr>
+        <w:tc>
+          <w:tcPr>
+            <w:tcW w:type="dxa" w:w="3024"/>
+            <w:shd w:fill="F2F4F7"/>
+            <w:vAlign w:val="center"/>
+          </w:tcPr>
+          <w:p>
+            <w:pPr>
+              <w:spacing w:after="0"/>
+            </w:pPr>
+            <w:r/>
+            <w:r>
+              <w:rPr>
+                <w:rFonts w:ascii="Calibri" w:hAnsi="Calibri"/>
+                <w:b/>
+                <w:sz w:val="18"/>
+              </w:rPr>
+              <w:t>Objective</w:t>
+            </w:r>
+          </w:p>
+        </w:tc>
+        <w:tc>
+          <w:tcPr>
+            <w:tcW w:type="dxa" w:w="1656"/>
+            <w:shd w:fill="F2F4F7"/>
+            <w:vAlign w:val="center"/>
+          </w:tcPr>
+          <w:p>
+            <w:pPr>
+              <w:spacing w:after="0"/>
+            </w:pPr>
+            <w:r/>
+            <w:r>
+              <w:rPr>
+                <w:rFonts w:ascii="Calibri" w:hAnsi="Calibri"/>
+                <w:b/>
+                <w:sz w:val="18"/>
+              </w:rPr>
+              <w:t>Related RQs</w:t>
+            </w:r>
+          </w:p>
+        </w:tc>
+        <w:tc>
+          <w:tcPr>
+            <w:tcW w:type="dxa" w:w="4392"/>
+            <w:shd w:fill="F2F4F7"/>
+            <w:vAlign w:val="center"/>
+          </w:tcPr>
+          <w:p>
+            <w:pPr>
+              <w:spacing w:after="0"/>
+            </w:pPr>
+            <w:r/>
+            <w:r>
+              <w:rPr>
+                <w:rFonts w:ascii="Calibri" w:hAnsi="Calibri"/>
+                <w:b/>
+                <w:sz w:val="18"/>
+              </w:rPr>
+              <w:t>Data Requirement</w:t>
+            </w:r>
+          </w:p>
+        </w:tc>
+      </w:tr>
+      <w:tr>
+        <w:tc>
+          <w:tcPr>
+            <w:tcW w:type="dxa" w:w="3024"/>
+            <w:vAlign w:val="center"/>
+          </w:tcPr>
+          <w:p>
+            <w:pPr>
+              <w:spacing w:after="0"/>
+            </w:pPr>
+            <w:r/>
+            <w:r>
+              <w:rPr>
+                <w:rFonts w:ascii="Calibri" w:hAnsi="Calibri"/>
+                <w:b w:val="0"/>
+                <w:sz w:val="18"/>
+              </w:rPr>
+              <w:t>Identify useful IVF outcome predictors.</w:t>
+            </w:r>
+          </w:p>
+        </w:tc>
+        <w:tc>
+          <w:tcPr>
+            <w:tcW w:type="dxa" w:w="1656"/>
+            <w:vAlign w:val="center"/>
+          </w:tcPr>
+          <w:p>
+            <w:pPr>
+              <w:spacing w:after="0"/>
+            </w:pPr>
+            <w:r/>
+            <w:r>
+              <w:rPr>
+                <w:rFonts w:ascii="Calibri" w:hAnsi="Calibri"/>
+                <w:b w:val="0"/>
+                <w:sz w:val="18"/>
+              </w:rPr>
+              <w:t>RQ1, RQ5</w:t>
+            </w:r>
+          </w:p>
+        </w:tc>
+        <w:tc>
+          <w:tcPr>
+            <w:tcW w:type="dxa" w:w="4392"/>
+            <w:vAlign w:val="center"/>
+          </w:tcPr>
+          <w:p>
+            <w:pPr>
+              <w:spacing w:after="0"/>
+            </w:pPr>
+            <w:r/>
+            <w:r>
+              <w:rPr>
+                <w:rFonts w:ascii="Calibri" w:hAnsi="Calibri"/>
+                <w:b w:val="0"/>
+                <w:sz w:val="18"/>
+              </w:rPr>
+              <w:t>Clinical variables and outcome.</w:t>
+            </w:r>
+          </w:p>
+        </w:tc>
+      </w:tr>
+      <w:tr>
+        <w:tc>
+          <w:tcPr>
+            <w:tcW w:type="dxa" w:w="3024"/>
+            <w:vAlign w:val="center"/>
+          </w:tcPr>
+          <w:p>
+            <w:pPr>
+              <w:spacing w:after="0"/>
+            </w:pPr>
+            <w:r/>
+            <w:r>
+              <w:rPr>
+                <w:rFonts w:ascii="Calibri" w:hAnsi="Calibri"/>
+                <w:b w:val="0"/>
+                <w:sz w:val="18"/>
+              </w:rPr>
+              <w:t>Compare baseline and ML models.</w:t>
+            </w:r>
+          </w:p>
+        </w:tc>
+        <w:tc>
+          <w:tcPr>
+            <w:tcW w:type="dxa" w:w="1656"/>
+            <w:vAlign w:val="center"/>
+          </w:tcPr>
+          <w:p>
+            <w:pPr>
+              <w:spacing w:after="0"/>
+            </w:pPr>
+            <w:r/>
+            <w:r>
+              <w:rPr>
+                <w:rFonts w:ascii="Calibri" w:hAnsi="Calibri"/>
+                <w:b w:val="0"/>
+                <w:sz w:val="18"/>
+              </w:rPr>
+              <w:t>RQ2, RQ6</w:t>
+            </w:r>
+          </w:p>
+        </w:tc>
+        <w:tc>
+          <w:tcPr>
+            <w:tcW w:type="dxa" w:w="4392"/>
+            <w:vAlign w:val="center"/>
+          </w:tcPr>
+          <w:p>
+            <w:pPr>
+              <w:spacing w:after="0"/>
+            </w:pPr>
+            <w:r/>
+            <w:r>
+              <w:rPr>
+                <w:rFonts w:ascii="Calibri" w:hAnsi="Calibri"/>
+                <w:b w:val="0"/>
+                <w:sz w:val="18"/>
+              </w:rPr>
+              <w:t>Model-development dataset.</w:t>
+            </w:r>
+          </w:p>
+        </w:tc>
+      </w:tr>
+      <w:tr>
+        <w:tc>
+          <w:tcPr>
+            <w:tcW w:type="dxa" w:w="3024"/>
+            <w:vAlign w:val="center"/>
+          </w:tcPr>
+          <w:p>
+            <w:pPr>
+              <w:spacing w:after="0"/>
+            </w:pPr>
+            <w:r/>
+            <w:r>
+              <w:rPr>
+                <w:rFonts w:ascii="Calibri" w:hAnsi="Calibri"/>
+                <w:b w:val="0"/>
+                <w:sz w:val="18"/>
+              </w:rPr>
+              <w:t>Test value of embryology data.</w:t>
+            </w:r>
+          </w:p>
+        </w:tc>
+        <w:tc>
+          <w:tcPr>
+            <w:tcW w:type="dxa" w:w="1656"/>
+            <w:vAlign w:val="center"/>
+          </w:tcPr>
+          <w:p>
+            <w:pPr>
+              <w:spacing w:after="0"/>
+            </w:pPr>
+            <w:r/>
+            <w:r>
+              <w:rPr>
+                <w:rFonts w:ascii="Calibri" w:hAnsi="Calibri"/>
+                <w:b w:val="0"/>
+                <w:sz w:val="18"/>
+              </w:rPr>
+              <w:t>RQ3</w:t>
+            </w:r>
+          </w:p>
+        </w:tc>
+        <w:tc>
+          <w:tcPr>
+            <w:tcW w:type="dxa" w:w="4392"/>
+            <w:vAlign w:val="center"/>
+          </w:tcPr>
+          <w:p>
+            <w:pPr>
+              <w:spacing w:after="0"/>
+            </w:pPr>
+            <w:r/>
+            <w:r>
+              <w:rPr>
+                <w:rFonts w:ascii="Calibri" w:hAnsi="Calibri"/>
+                <w:b w:val="0"/>
+                <w:sz w:val="18"/>
+              </w:rPr>
+              <w:t>Structured embryology variables.</w:t>
+            </w:r>
+          </w:p>
+        </w:tc>
+      </w:tr>
+      <w:tr>
+        <w:tc>
+          <w:tcPr>
+            <w:tcW w:type="dxa" w:w="3024"/>
+            <w:vAlign w:val="center"/>
+          </w:tcPr>
+          <w:p>
+            <w:pPr>
+              <w:spacing w:after="0"/>
+            </w:pPr>
+            <w:r/>
+            <w:r>
+              <w:rPr>
+                <w:rFonts w:ascii="Calibri" w:hAnsi="Calibri"/>
+                <w:b w:val="0"/>
+                <w:sz w:val="18"/>
+              </w:rPr>
+              <w:t>Test value of lifestyle/contextual data.</w:t>
+            </w:r>
+          </w:p>
+        </w:tc>
+        <w:tc>
+          <w:tcPr>
+            <w:tcW w:type="dxa" w:w="1656"/>
+            <w:vAlign w:val="center"/>
+          </w:tcPr>
+          <w:p>
+            <w:pPr>
+              <w:spacing w:after="0"/>
+            </w:pPr>
+            <w:r/>
+            <w:r>
+              <w:rPr>
+                <w:rFonts w:ascii="Calibri" w:hAnsi="Calibri"/>
+                <w:b w:val="0"/>
+                <w:sz w:val="18"/>
+              </w:rPr>
+              <w:t>RQ4</w:t>
+            </w:r>
+          </w:p>
+        </w:tc>
+        <w:tc>
+          <w:tcPr>
+            <w:tcW w:type="dxa" w:w="4392"/>
+            <w:vAlign w:val="center"/>
+          </w:tcPr>
+          <w:p>
+            <w:pPr>
+              <w:spacing w:after="0"/>
+            </w:pPr>
+            <w:r/>
+            <w:r>
+              <w:rPr>
+                <w:rFonts w:ascii="Calibri" w:hAnsi="Calibri"/>
+                <w:b w:val="0"/>
+                <w:sz w:val="18"/>
+              </w:rPr>
+              <w:t>Reliable lifestyle data.</w:t>
+            </w:r>
+          </w:p>
+        </w:tc>
+      </w:tr>
+      <w:tr>
+        <w:tc>
+          <w:tcPr>
+            <w:tcW w:type="dxa" w:w="3024"/>
+            <w:vAlign w:val="center"/>
+          </w:tcPr>
+          <w:p>
+            <w:pPr>
+              <w:spacing w:after="0"/>
+            </w:pPr>
+            <w:r/>
+            <w:r>
+              <w:rPr>
+                <w:rFonts w:ascii="Calibri" w:hAnsi="Calibri"/>
+                <w:b w:val="0"/>
+                <w:sz w:val="18"/>
+              </w:rPr>
+              <w:t>Evaluate validation/generalization.</w:t>
+            </w:r>
+          </w:p>
+        </w:tc>
+        <w:tc>
+          <w:tcPr>
+            <w:tcW w:type="dxa" w:w="1656"/>
+            <w:vAlign w:val="center"/>
+          </w:tcPr>
+          <w:p>
+            <w:pPr>
+              <w:spacing w:after="0"/>
+            </w:pPr>
+            <w:r/>
+            <w:r>
+              <w:rPr>
+                <w:rFonts w:ascii="Calibri" w:hAnsi="Calibri"/>
+                <w:b w:val="0"/>
+                <w:sz w:val="18"/>
+              </w:rPr>
+              <w:t>RQ7, RQ8</w:t>
+            </w:r>
+          </w:p>
+        </w:tc>
+        <w:tc>
+          <w:tcPr>
+            <w:tcW w:type="dxa" w:w="4392"/>
+            <w:vAlign w:val="center"/>
+          </w:tcPr>
+          <w:p>
+            <w:pPr>
+              <w:spacing w:after="0"/>
+            </w:pPr>
+            <w:r/>
+            <w:r>
+              <w:rPr>
+                <w:rFonts w:ascii="Calibri" w:hAnsi="Calibri"/>
+                <w:b w:val="0"/>
+                <w:sz w:val="18"/>
+              </w:rPr>
+              <w:t>Subgroup, temporal or external validation data.</w:t>
+            </w:r>
+          </w:p>
+        </w:tc>
+      </w:tr>
+      <w:tr>
+        <w:tc>
+          <w:tcPr>
+            <w:tcW w:type="dxa" w:w="3024"/>
+            <w:vAlign w:val="center"/>
+          </w:tcPr>
+          <w:p>
+            <w:pPr>
+              <w:spacing w:after="0"/>
+            </w:pPr>
+            <w:r/>
+            <w:r>
+              <w:rPr>
+                <w:rFonts w:ascii="Calibri" w:hAnsi="Calibri"/>
+                <w:b w:val="0"/>
+                <w:sz w:val="18"/>
+              </w:rPr>
+              <w:t>Evaluate clinician-facing explanations.</w:t>
+            </w:r>
+          </w:p>
+        </w:tc>
+        <w:tc>
+          <w:tcPr>
+            <w:tcW w:type="dxa" w:w="1656"/>
+            <w:vAlign w:val="center"/>
+          </w:tcPr>
+          <w:p>
+            <w:pPr>
+              <w:spacing w:after="0"/>
+            </w:pPr>
+            <w:r/>
+            <w:r>
+              <w:rPr>
+                <w:rFonts w:ascii="Calibri" w:hAnsi="Calibri"/>
+                <w:b w:val="0"/>
+                <w:sz w:val="18"/>
+              </w:rPr>
+              <w:t>RQ9</w:t>
+            </w:r>
+          </w:p>
+        </w:tc>
+        <w:tc>
+          <w:tcPr>
+            <w:tcW w:type="dxa" w:w="4392"/>
+            <w:vAlign w:val="center"/>
+          </w:tcPr>
+          <w:p>
+            <w:pPr>
+              <w:spacing w:after="0"/>
+            </w:pPr>
+            <w:r/>
+            <w:r>
+              <w:rPr>
+                <w:rFonts w:ascii="Calibri" w:hAnsi="Calibri"/>
+                <w:b w:val="0"/>
+                <w:sz w:val="18"/>
+              </w:rPr>
+              <w:t>Doctor review protocol.</w:t>
             </w:r>
           </w:p>
         </w:tc>
@@ -316,12 +3048,773 @@
         <w:t>Statistical and ML Evaluation Plan</w:t>
       </w:r>
     </w:p>
+    <w:tbl>
+      <w:tblPr>
+        <w:tblStyle w:val="TableGrid"/>
+        <w:tblW w:type="auto" w:w="0"/>
+        <w:jc w:val="center"/>
+        <w:tblLook w:firstColumn="1" w:firstRow="1" w:lastColumn="0" w:lastRow="0" w:noHBand="0" w:noVBand="1" w:val="04A0"/>
+      </w:tblPr>
+      <w:tblGrid>
+        <w:gridCol w:w="3120"/>
+        <w:gridCol w:w="3120"/>
+        <w:gridCol w:w="3120"/>
+      </w:tblGrid>
+      <w:tr>
+        <w:tc>
+          <w:tcPr>
+            <w:tcW w:type="dxa" w:w="2232"/>
+            <w:shd w:fill="F2F4F7"/>
+            <w:vAlign w:val="center"/>
+          </w:tcPr>
+          <w:p>
+            <w:pPr>
+              <w:spacing w:after="0"/>
+            </w:pPr>
+            <w:r/>
+            <w:r>
+              <w:rPr>
+                <w:rFonts w:ascii="Calibri" w:hAnsi="Calibri"/>
+                <w:b/>
+                <w:sz w:val="18"/>
+              </w:rPr>
+              <w:t>Question Type</w:t>
+            </w:r>
+          </w:p>
+        </w:tc>
+        <w:tc>
+          <w:tcPr>
+            <w:tcW w:type="dxa" w:w="3456"/>
+            <w:shd w:fill="F2F4F7"/>
+            <w:vAlign w:val="center"/>
+          </w:tcPr>
+          <w:p>
+            <w:pPr>
+              <w:spacing w:after="0"/>
+            </w:pPr>
+            <w:r/>
+            <w:r>
+              <w:rPr>
+                <w:rFonts w:ascii="Calibri" w:hAnsi="Calibri"/>
+                <w:b/>
+                <w:sz w:val="18"/>
+              </w:rPr>
+              <w:t>Suitable Analysis</w:t>
+            </w:r>
+          </w:p>
+        </w:tc>
+        <w:tc>
+          <w:tcPr>
+            <w:tcW w:type="dxa" w:w="3384"/>
+            <w:shd w:fill="F2F4F7"/>
+            <w:vAlign w:val="center"/>
+          </w:tcPr>
+          <w:p>
+            <w:pPr>
+              <w:spacing w:after="0"/>
+            </w:pPr>
+            <w:r/>
+            <w:r>
+              <w:rPr>
+                <w:rFonts w:ascii="Calibri" w:hAnsi="Calibri"/>
+                <w:b/>
+                <w:sz w:val="18"/>
+              </w:rPr>
+              <w:t>Important Note</w:t>
+            </w:r>
+          </w:p>
+        </w:tc>
+      </w:tr>
+      <w:tr>
+        <w:tc>
+          <w:tcPr>
+            <w:tcW w:type="dxa" w:w="2232"/>
+            <w:vAlign w:val="center"/>
+          </w:tcPr>
+          <w:p>
+            <w:pPr>
+              <w:spacing w:after="0"/>
+            </w:pPr>
+            <w:r/>
+            <w:r>
+              <w:rPr>
+                <w:rFonts w:ascii="Calibri" w:hAnsi="Calibri"/>
+                <w:b w:val="0"/>
+                <w:sz w:val="18"/>
+              </w:rPr>
+              <w:t>Dataset description</w:t>
+            </w:r>
+          </w:p>
+        </w:tc>
+        <w:tc>
+          <w:tcPr>
+            <w:tcW w:type="dxa" w:w="3456"/>
+            <w:vAlign w:val="center"/>
+          </w:tcPr>
+          <w:p>
+            <w:pPr>
+              <w:spacing w:after="0"/>
+            </w:pPr>
+            <w:r/>
+            <w:r>
+              <w:rPr>
+                <w:rFonts w:ascii="Calibri" w:hAnsi="Calibri"/>
+                <w:b w:val="0"/>
+                <w:sz w:val="18"/>
+              </w:rPr>
+              <w:t>Descriptive statistics, missingness summary, outcome rate.</w:t>
+            </w:r>
+          </w:p>
+        </w:tc>
+        <w:tc>
+          <w:tcPr>
+            <w:tcW w:type="dxa" w:w="3384"/>
+            <w:vAlign w:val="center"/>
+          </w:tcPr>
+          <w:p>
+            <w:pPr>
+              <w:spacing w:after="0"/>
+            </w:pPr>
+            <w:r/>
+            <w:r>
+              <w:rPr>
+                <w:rFonts w:ascii="Calibri" w:hAnsi="Calibri"/>
+                <w:b w:val="0"/>
+                <w:sz w:val="18"/>
+              </w:rPr>
+              <w:t>Required before modelling.</w:t>
+            </w:r>
+          </w:p>
+        </w:tc>
+      </w:tr>
+      <w:tr>
+        <w:tc>
+          <w:tcPr>
+            <w:tcW w:type="dxa" w:w="2232"/>
+            <w:vAlign w:val="center"/>
+          </w:tcPr>
+          <w:p>
+            <w:pPr>
+              <w:spacing w:after="0"/>
+            </w:pPr>
+            <w:r/>
+            <w:r>
+              <w:rPr>
+                <w:rFonts w:ascii="Calibri" w:hAnsi="Calibri"/>
+                <w:b w:val="0"/>
+                <w:sz w:val="18"/>
+              </w:rPr>
+              <w:t>Group comparison</w:t>
+            </w:r>
+          </w:p>
+        </w:tc>
+        <w:tc>
+          <w:tcPr>
+            <w:tcW w:type="dxa" w:w="3456"/>
+            <w:vAlign w:val="center"/>
+          </w:tcPr>
+          <w:p>
+            <w:pPr>
+              <w:spacing w:after="0"/>
+            </w:pPr>
+            <w:r/>
+            <w:r>
+              <w:rPr>
+                <w:rFonts w:ascii="Calibri" w:hAnsi="Calibri"/>
+                <w:b w:val="0"/>
+                <w:sz w:val="18"/>
+              </w:rPr>
+              <w:t>Chi-square, t-test or Mann-Whitney U as appropriate.</w:t>
+            </w:r>
+          </w:p>
+        </w:tc>
+        <w:tc>
+          <w:tcPr>
+            <w:tcW w:type="dxa" w:w="3384"/>
+            <w:vAlign w:val="center"/>
+          </w:tcPr>
+          <w:p>
+            <w:pPr>
+              <w:spacing w:after="0"/>
+            </w:pPr>
+            <w:r/>
+            <w:r>
+              <w:rPr>
+                <w:rFonts w:ascii="Calibri" w:hAnsi="Calibri"/>
+                <w:b w:val="0"/>
+                <w:sz w:val="18"/>
+              </w:rPr>
+              <w:t>Depends on variable type and distribution.</w:t>
+            </w:r>
+          </w:p>
+        </w:tc>
+      </w:tr>
+      <w:tr>
+        <w:tc>
+          <w:tcPr>
+            <w:tcW w:type="dxa" w:w="2232"/>
+            <w:vAlign w:val="center"/>
+          </w:tcPr>
+          <w:p>
+            <w:pPr>
+              <w:spacing w:after="0"/>
+            </w:pPr>
+            <w:r/>
+            <w:r>
+              <w:rPr>
+                <w:rFonts w:ascii="Calibri" w:hAnsi="Calibri"/>
+                <w:b w:val="0"/>
+                <w:sz w:val="18"/>
+              </w:rPr>
+              <w:t>Binary outcome association</w:t>
+            </w:r>
+          </w:p>
+        </w:tc>
+        <w:tc>
+          <w:tcPr>
+            <w:tcW w:type="dxa" w:w="3456"/>
+            <w:vAlign w:val="center"/>
+          </w:tcPr>
+          <w:p>
+            <w:pPr>
+              <w:spacing w:after="0"/>
+            </w:pPr>
+            <w:r/>
+            <w:r>
+              <w:rPr>
+                <w:rFonts w:ascii="Calibri" w:hAnsi="Calibri"/>
+                <w:b w:val="0"/>
+                <w:sz w:val="18"/>
+              </w:rPr>
+              <w:t>Logistic regression.</w:t>
+            </w:r>
+          </w:p>
+        </w:tc>
+        <w:tc>
+          <w:tcPr>
+            <w:tcW w:type="dxa" w:w="3384"/>
+            <w:vAlign w:val="center"/>
+          </w:tcPr>
+          <w:p>
+            <w:pPr>
+              <w:spacing w:after="0"/>
+            </w:pPr>
+            <w:r/>
+            <w:r>
+              <w:rPr>
+                <w:rFonts w:ascii="Calibri" w:hAnsi="Calibri"/>
+                <w:b w:val="0"/>
+                <w:sz w:val="18"/>
+              </w:rPr>
+              <w:t>Useful baseline and interpretable model.</w:t>
+            </w:r>
+          </w:p>
+        </w:tc>
+      </w:tr>
+      <w:tr>
+        <w:tc>
+          <w:tcPr>
+            <w:tcW w:type="dxa" w:w="2232"/>
+            <w:vAlign w:val="center"/>
+          </w:tcPr>
+          <w:p>
+            <w:pPr>
+              <w:spacing w:after="0"/>
+            </w:pPr>
+            <w:r/>
+            <w:r>
+              <w:rPr>
+                <w:rFonts w:ascii="Calibri" w:hAnsi="Calibri"/>
+                <w:b w:val="0"/>
+                <w:sz w:val="18"/>
+              </w:rPr>
+              <w:t>Model discrimination</w:t>
+            </w:r>
+          </w:p>
+        </w:tc>
+        <w:tc>
+          <w:tcPr>
+            <w:tcW w:type="dxa" w:w="3456"/>
+            <w:vAlign w:val="center"/>
+          </w:tcPr>
+          <w:p>
+            <w:pPr>
+              <w:spacing w:after="0"/>
+            </w:pPr>
+            <w:r/>
+            <w:r>
+              <w:rPr>
+                <w:rFonts w:ascii="Calibri" w:hAnsi="Calibri"/>
+                <w:b w:val="0"/>
+                <w:sz w:val="18"/>
+              </w:rPr>
+              <w:t>AUC/ROC, PR-AUC, sensitivity, specificity.</w:t>
+            </w:r>
+          </w:p>
+        </w:tc>
+        <w:tc>
+          <w:tcPr>
+            <w:tcW w:type="dxa" w:w="3384"/>
+            <w:vAlign w:val="center"/>
+          </w:tcPr>
+          <w:p>
+            <w:pPr>
+              <w:spacing w:after="0"/>
+            </w:pPr>
+            <w:r/>
+            <w:r>
+              <w:rPr>
+                <w:rFonts w:ascii="Calibri" w:hAnsi="Calibri"/>
+                <w:b w:val="0"/>
+                <w:sz w:val="18"/>
+              </w:rPr>
+              <w:t>AUC alone is not enough.</w:t>
+            </w:r>
+          </w:p>
+        </w:tc>
+      </w:tr>
+      <w:tr>
+        <w:tc>
+          <w:tcPr>
+            <w:tcW w:type="dxa" w:w="2232"/>
+            <w:vAlign w:val="center"/>
+          </w:tcPr>
+          <w:p>
+            <w:pPr>
+              <w:spacing w:after="0"/>
+            </w:pPr>
+            <w:r/>
+            <w:r>
+              <w:rPr>
+                <w:rFonts w:ascii="Calibri" w:hAnsi="Calibri"/>
+                <w:b w:val="0"/>
+                <w:sz w:val="18"/>
+              </w:rPr>
+              <w:t>Probability reliability</w:t>
+            </w:r>
+          </w:p>
+        </w:tc>
+        <w:tc>
+          <w:tcPr>
+            <w:tcW w:type="dxa" w:w="3456"/>
+            <w:vAlign w:val="center"/>
+          </w:tcPr>
+          <w:p>
+            <w:pPr>
+              <w:spacing w:after="0"/>
+            </w:pPr>
+            <w:r/>
+            <w:r>
+              <w:rPr>
+                <w:rFonts w:ascii="Calibri" w:hAnsi="Calibri"/>
+                <w:b w:val="0"/>
+                <w:sz w:val="18"/>
+              </w:rPr>
+              <w:t>Calibration curve, Brier score.</w:t>
+            </w:r>
+          </w:p>
+        </w:tc>
+        <w:tc>
+          <w:tcPr>
+            <w:tcW w:type="dxa" w:w="3384"/>
+            <w:vAlign w:val="center"/>
+          </w:tcPr>
+          <w:p>
+            <w:pPr>
+              <w:spacing w:after="0"/>
+            </w:pPr>
+            <w:r/>
+            <w:r>
+              <w:rPr>
+                <w:rFonts w:ascii="Calibri" w:hAnsi="Calibri"/>
+                <w:b w:val="0"/>
+                <w:sz w:val="18"/>
+              </w:rPr>
+              <w:t>Important for counseling.</w:t>
+            </w:r>
+          </w:p>
+        </w:tc>
+      </w:tr>
+      <w:tr>
+        <w:tc>
+          <w:tcPr>
+            <w:tcW w:type="dxa" w:w="2232"/>
+            <w:vAlign w:val="center"/>
+          </w:tcPr>
+          <w:p>
+            <w:pPr>
+              <w:spacing w:after="0"/>
+            </w:pPr>
+            <w:r/>
+            <w:r>
+              <w:rPr>
+                <w:rFonts w:ascii="Calibri" w:hAnsi="Calibri"/>
+                <w:b w:val="0"/>
+                <w:sz w:val="18"/>
+              </w:rPr>
+              <w:t>Imbalanced outcome</w:t>
+            </w:r>
+          </w:p>
+        </w:tc>
+        <w:tc>
+          <w:tcPr>
+            <w:tcW w:type="dxa" w:w="3456"/>
+            <w:vAlign w:val="center"/>
+          </w:tcPr>
+          <w:p>
+            <w:pPr>
+              <w:spacing w:after="0"/>
+            </w:pPr>
+            <w:r/>
+            <w:r>
+              <w:rPr>
+                <w:rFonts w:ascii="Calibri" w:hAnsi="Calibri"/>
+                <w:b w:val="0"/>
+                <w:sz w:val="18"/>
+              </w:rPr>
+              <w:t>Precision, recall, F1, PR-AUC.</w:t>
+            </w:r>
+          </w:p>
+        </w:tc>
+        <w:tc>
+          <w:tcPr>
+            <w:tcW w:type="dxa" w:w="3384"/>
+            <w:vAlign w:val="center"/>
+          </w:tcPr>
+          <w:p>
+            <w:pPr>
+              <w:spacing w:after="0"/>
+            </w:pPr>
+            <w:r/>
+            <w:r>
+              <w:rPr>
+                <w:rFonts w:ascii="Calibri" w:hAnsi="Calibri"/>
+                <w:b w:val="0"/>
+                <w:sz w:val="18"/>
+              </w:rPr>
+              <w:t>Important if positive outcome class is rare.</w:t>
+            </w:r>
+          </w:p>
+        </w:tc>
+      </w:tr>
+      <w:tr>
+        <w:tc>
+          <w:tcPr>
+            <w:tcW w:type="dxa" w:w="2232"/>
+            <w:vAlign w:val="center"/>
+          </w:tcPr>
+          <w:p>
+            <w:pPr>
+              <w:spacing w:after="0"/>
+            </w:pPr>
+            <w:r/>
+            <w:r>
+              <w:rPr>
+                <w:rFonts w:ascii="Calibri" w:hAnsi="Calibri"/>
+                <w:b w:val="0"/>
+                <w:sz w:val="18"/>
+              </w:rPr>
+              <w:t>Model comparison</w:t>
+            </w:r>
+          </w:p>
+        </w:tc>
+        <w:tc>
+          <w:tcPr>
+            <w:tcW w:type="dxa" w:w="3456"/>
+            <w:vAlign w:val="center"/>
+          </w:tcPr>
+          <w:p>
+            <w:pPr>
+              <w:spacing w:after="0"/>
+            </w:pPr>
+            <w:r/>
+            <w:r>
+              <w:rPr>
+                <w:rFonts w:ascii="Calibri" w:hAnsi="Calibri"/>
+                <w:b w:val="0"/>
+                <w:sz w:val="18"/>
+              </w:rPr>
+              <w:t>Cross-validation/test-set metrics; DeLong test if appropriate.</w:t>
+            </w:r>
+          </w:p>
+        </w:tc>
+        <w:tc>
+          <w:tcPr>
+            <w:tcW w:type="dxa" w:w="3384"/>
+            <w:vAlign w:val="center"/>
+          </w:tcPr>
+          <w:p>
+            <w:pPr>
+              <w:spacing w:after="0"/>
+            </w:pPr>
+            <w:r/>
+            <w:r>
+              <w:rPr>
+                <w:rFonts w:ascii="Calibri" w:hAnsi="Calibri"/>
+                <w:b w:val="0"/>
+                <w:sz w:val="18"/>
+              </w:rPr>
+              <w:t>Avoid data leakage.</w:t>
+            </w:r>
+          </w:p>
+        </w:tc>
+      </w:tr>
+      <w:tr>
+        <w:tc>
+          <w:tcPr>
+            <w:tcW w:type="dxa" w:w="2232"/>
+            <w:vAlign w:val="center"/>
+          </w:tcPr>
+          <w:p>
+            <w:pPr>
+              <w:spacing w:after="0"/>
+            </w:pPr>
+            <w:r/>
+            <w:r>
+              <w:rPr>
+                <w:rFonts w:ascii="Calibri" w:hAnsi="Calibri"/>
+                <w:b w:val="0"/>
+                <w:sz w:val="18"/>
+              </w:rPr>
+              <w:t>Feature contribution</w:t>
+            </w:r>
+          </w:p>
+        </w:tc>
+        <w:tc>
+          <w:tcPr>
+            <w:tcW w:type="dxa" w:w="3456"/>
+            <w:vAlign w:val="center"/>
+          </w:tcPr>
+          <w:p>
+            <w:pPr>
+              <w:spacing w:after="0"/>
+            </w:pPr>
+            <w:r/>
+            <w:r>
+              <w:rPr>
+                <w:rFonts w:ascii="Calibri" w:hAnsi="Calibri"/>
+                <w:b w:val="0"/>
+                <w:sz w:val="18"/>
+              </w:rPr>
+              <w:t>SHAP, permutation importance.</w:t>
+            </w:r>
+          </w:p>
+        </w:tc>
+        <w:tc>
+          <w:tcPr>
+            <w:tcW w:type="dxa" w:w="3384"/>
+            <w:vAlign w:val="center"/>
+          </w:tcPr>
+          <w:p>
+            <w:pPr>
+              <w:spacing w:after="0"/>
+            </w:pPr>
+            <w:r/>
+            <w:r>
+              <w:rPr>
+                <w:rFonts w:ascii="Calibri" w:hAnsi="Calibri"/>
+                <w:b w:val="0"/>
+                <w:sz w:val="18"/>
+              </w:rPr>
+              <w:t>Explanation, not causality.</w:t>
+            </w:r>
+          </w:p>
+        </w:tc>
+      </w:tr>
+      <w:tr>
+        <w:tc>
+          <w:tcPr>
+            <w:tcW w:type="dxa" w:w="2232"/>
+            <w:vAlign w:val="center"/>
+          </w:tcPr>
+          <w:p>
+            <w:pPr>
+              <w:spacing w:after="0"/>
+            </w:pPr>
+            <w:r/>
+            <w:r>
+              <w:rPr>
+                <w:rFonts w:ascii="Calibri" w:hAnsi="Calibri"/>
+                <w:b w:val="0"/>
+                <w:sz w:val="18"/>
+              </w:rPr>
+              <w:t>Subgroup behavior</w:t>
+            </w:r>
+          </w:p>
+        </w:tc>
+        <w:tc>
+          <w:tcPr>
+            <w:tcW w:type="dxa" w:w="3456"/>
+            <w:vAlign w:val="center"/>
+          </w:tcPr>
+          <w:p>
+            <w:pPr>
+              <w:spacing w:after="0"/>
+            </w:pPr>
+            <w:r/>
+            <w:r>
+              <w:rPr>
+                <w:rFonts w:ascii="Calibri" w:hAnsi="Calibri"/>
+                <w:b w:val="0"/>
+                <w:sz w:val="18"/>
+              </w:rPr>
+              <w:t>Stratified metrics, interaction terms.</w:t>
+            </w:r>
+          </w:p>
+        </w:tc>
+        <w:tc>
+          <w:tcPr>
+            <w:tcW w:type="dxa" w:w="3384"/>
+            <w:vAlign w:val="center"/>
+          </w:tcPr>
+          <w:p>
+            <w:pPr>
+              <w:spacing w:after="0"/>
+            </w:pPr>
+            <w:r/>
+            <w:r>
+              <w:rPr>
+                <w:rFonts w:ascii="Calibri" w:hAnsi="Calibri"/>
+                <w:b w:val="0"/>
+                <w:sz w:val="18"/>
+              </w:rPr>
+              <w:t>Needs sufficient sample size.</w:t>
+            </w:r>
+          </w:p>
+        </w:tc>
+      </w:tr>
+      <w:tr>
+        <w:tc>
+          <w:tcPr>
+            <w:tcW w:type="dxa" w:w="2232"/>
+            <w:vAlign w:val="center"/>
+          </w:tcPr>
+          <w:p>
+            <w:pPr>
+              <w:spacing w:after="0"/>
+            </w:pPr>
+            <w:r/>
+            <w:r>
+              <w:rPr>
+                <w:rFonts w:ascii="Calibri" w:hAnsi="Calibri"/>
+                <w:b w:val="0"/>
+                <w:sz w:val="18"/>
+              </w:rPr>
+              <w:t>Clinical usefulness</w:t>
+            </w:r>
+          </w:p>
+        </w:tc>
+        <w:tc>
+          <w:tcPr>
+            <w:tcW w:type="dxa" w:w="3456"/>
+            <w:vAlign w:val="center"/>
+          </w:tcPr>
+          <w:p>
+            <w:pPr>
+              <w:spacing w:after="0"/>
+            </w:pPr>
+            <w:r/>
+            <w:r>
+              <w:rPr>
+                <w:rFonts w:ascii="Calibri" w:hAnsi="Calibri"/>
+                <w:b w:val="0"/>
+                <w:sz w:val="18"/>
+              </w:rPr>
+              <w:t>Decision curve analysis if thresholds are meaningful.</w:t>
+            </w:r>
+          </w:p>
+        </w:tc>
+        <w:tc>
+          <w:tcPr>
+            <w:tcW w:type="dxa" w:w="3384"/>
+            <w:vAlign w:val="center"/>
+          </w:tcPr>
+          <w:p>
+            <w:pPr>
+              <w:spacing w:after="0"/>
+            </w:pPr>
+            <w:r/>
+            <w:r>
+              <w:rPr>
+                <w:rFonts w:ascii="Calibri" w:hAnsi="Calibri"/>
+                <w:b w:val="0"/>
+                <w:sz w:val="18"/>
+              </w:rPr>
+              <w:t>Use only if clinically interpretable.</w:t>
+            </w:r>
+          </w:p>
+        </w:tc>
+      </w:tr>
+      <w:tr>
+        <w:tc>
+          <w:tcPr>
+            <w:tcW w:type="dxa" w:w="2232"/>
+            <w:vAlign w:val="center"/>
+          </w:tcPr>
+          <w:p>
+            <w:pPr>
+              <w:spacing w:after="0"/>
+            </w:pPr>
+            <w:r/>
+            <w:r>
+              <w:rPr>
+                <w:rFonts w:ascii="Calibri" w:hAnsi="Calibri"/>
+                <w:b w:val="0"/>
+                <w:sz w:val="18"/>
+              </w:rPr>
+              <w:t>Clinician review</w:t>
+            </w:r>
+          </w:p>
+        </w:tc>
+        <w:tc>
+          <w:tcPr>
+            <w:tcW w:type="dxa" w:w="3456"/>
+            <w:vAlign w:val="center"/>
+          </w:tcPr>
+          <w:p>
+            <w:pPr>
+              <w:spacing w:after="0"/>
+            </w:pPr>
+            <w:r/>
+            <w:r>
+              <w:rPr>
+                <w:rFonts w:ascii="Calibri" w:hAnsi="Calibri"/>
+                <w:b w:val="0"/>
+                <w:sz w:val="18"/>
+              </w:rPr>
+              <w:t>Likert-scale survey and qualitative feedback.</w:t>
+            </w:r>
+          </w:p>
+        </w:tc>
+        <w:tc>
+          <w:tcPr>
+            <w:tcW w:type="dxa" w:w="3384"/>
+            <w:vAlign w:val="center"/>
+          </w:tcPr>
+          <w:p>
+            <w:pPr>
+              <w:spacing w:after="0"/>
+            </w:pPr>
+            <w:r/>
+            <w:r>
+              <w:rPr>
+                <w:rFonts w:ascii="Calibri" w:hAnsi="Calibri"/>
+                <w:b w:val="0"/>
+                <w:sz w:val="18"/>
+              </w:rPr>
+              <w:t>Requires review protocol.</w:t>
+            </w:r>
+          </w:p>
+        </w:tc>
+      </w:tr>
+    </w:tbl>
+    <w:p/>
     <w:p>
       <w:pPr>
-        <w:pStyle w:val="ListBullet"/>
+        <w:pStyle w:val="Heading1"/>
       </w:pPr>
       <w:r>
-        <w:t>Use descriptive statistics to summarize age, BMI, diagnosis, treatment type and outcomes.</w:t>
+        <w:t>Safe Current Position</w:t>
       </w:r>
     </w:p>
     <w:p>
@@ -329,7 +3822,7 @@
         <w:pStyle w:val="ListBullet"/>
       </w:pPr>
       <w:r>
-        <w:t>Use appropriate univariate comparison tests depending on variable type and distribution.</w:t>
+        <w:t>The main hypothesis is not finalized because the dependent variable and predictor set are not confirmed.</w:t>
       </w:r>
     </w:p>
     <w:p>
@@ -337,7 +3830,7 @@
         <w:pStyle w:val="ListBullet"/>
       </w:pPr>
       <w:r>
-        <w:t>Use train/validation/test, cross-validation, bootstrap, temporal validation or external validation depending on dataset size and source.</w:t>
+        <w:t>A safe tentative hypothesis is that an explainable model using available IVF clinical variables can predict the selected outcome better than chance and provide interpretable patient-level explanations.</w:t>
       </w:r>
     </w:p>
     <w:p>
@@ -345,7 +3838,7 @@
         <w:pStyle w:val="ListBullet"/>
       </w:pPr>
       <w:r>
-        <w:t>Report discrimination metrics such as AUC, sensitivity and specificity.</w:t>
+        <w:t>If embryology data is available, an additional hypothesis can test whether embryology variables improve prediction over clinical variables alone.</w:t>
       </w:r>
     </w:p>
     <w:p>
@@ -353,47 +3846,7 @@
         <w:pStyle w:val="ListBullet"/>
       </w:pPr>
       <w:r>
-        <w:t>Report calibration because a clinically useful probability must be reliable, not only ranked correctly.</w:t>
-      </w:r>
-    </w:p>
-    <w:p>
-      <w:pPr>
-        <w:pStyle w:val="ListBullet"/>
-      </w:pPr>
-      <w:r>
-        <w:t>Perform subgroup analysis only when sample sizes are sufficient.</w:t>
-      </w:r>
-    </w:p>
-    <w:p>
-      <w:pPr>
-        <w:pStyle w:val="Heading1"/>
-      </w:pPr>
-      <w:r>
-        <w:t>Not Final Yet</w:t>
-      </w:r>
-    </w:p>
-    <w:p>
-      <w:pPr>
-        <w:pStyle w:val="ListBullet"/>
-      </w:pPr>
-      <w:r>
-        <w:t>Final dependent variable: live birth is preferred but may not be available.</w:t>
-      </w:r>
-    </w:p>
-    <w:p>
-      <w:pPr>
-        <w:pStyle w:val="ListBullet"/>
-      </w:pPr>
-      <w:r>
-        <w:t>Final hypotheses: must match actual variables and outcomes.</w:t>
-      </w:r>
-    </w:p>
-    <w:p>
-      <w:pPr>
-        <w:pStyle w:val="ListBullet"/>
-      </w:pPr>
-      <w:r>
-        <w:t>Final validation plan: depends on whether more than one clinic/source/time period is available.</w:t>
+        <w:t>Improved IVF success rate should not be claimed unless future prospective clinical validation proves it.</w:t>
       </w:r>
     </w:p>
     <w:sectPr>

</xml_diff>